<commit_message>
feat: add contract ID prefixes for Paga Local Colombia contracts
- Add generate_contract_id() support for 9 new Paga Local contract types
- Add UI badges in FKReviewQueue for all PL contract types
- Update combined_schema.sql with new CASE-based prefix logic
- Add migration file for Paga Local contract ID prefixes
- Update Mandato template

Prefixes: PLCR (Credito), PLCM (Mandato), PLMI (Mandato IM),
PLSD (Solicitud Desembolso), PLDM (DIAN Mandato)

🤖 Generated with [Claude Code](https://claude.com/claude-code)

Co-Authored-By: Claude <noreply@anthropic.com>
</commit_message>
<xml_diff>
--- a/backend/templates/FK COL paga local - Fin. COP - K° Mandato.docx
+++ b/backend/templates/FK COL paga local - Fin. COP - K° Mandato.docx
@@ -1,6 +1,6 @@
 
 <file path=word/document.xml><?xml version="1.0" encoding="utf-8"?>
-<w:document xmlns:wpc="http://schemas.microsoft.com/office/word/2010/wordprocessingCanvas" xmlns:cx="http://schemas.microsoft.com/office/drawing/2014/chartex" xmlns:cx1="http://schemas.microsoft.com/office/drawing/2015/9/8/chartex" xmlns:cx2="http://schemas.microsoft.com/office/drawing/2015/10/21/chartex" xmlns:cx3="http://schemas.microsoft.com/office/drawing/2016/5/9/chartex" xmlns:cx4="http://schemas.microsoft.com/office/drawing/2016/5/10/chartex" xmlns:cx5="http://schemas.microsoft.com/office/drawing/2016/5/11/chartex" xmlns:cx6="http://schemas.microsoft.com/office/drawing/2016/5/12/chartex" xmlns:cx7="http://schemas.microsoft.com/office/drawing/2016/5/13/chartex" xmlns:cx8="http://schemas.microsoft.com/office/drawing/2016/5/14/chartex" xmlns:mc="http://schemas.openxmlformats.org/markup-compatibility/2006" xmlns:aink="http://schemas.microsoft.com/office/drawing/2016/ink" xmlns:am3d="http://schemas.microsoft.com/office/drawing/2017/model3d" xmlns:o="urn:schemas-microsoft-com:office:office" xmlns:oel="http://schemas.microsoft.com/office/2019/extlst" xmlns:r="http://schemas.openxmlformats.org/officeDocument/2006/relationships" xmlns:m="http://schemas.openxmlformats.org/officeDocument/2006/math" xmlns:v="urn:schemas-microsoft-com:vml" xmlns:wp14="http://schemas.microsoft.com/office/word/2010/wordprocessingDrawing" xmlns:wp="http://schemas.openxmlformats.org/drawingml/2006/wordprocessingDrawing" xmlns:w10="urn:schemas-microsoft-com:office:word" xmlns:w="http://schemas.openxmlformats.org/wordprocessingml/2006/main" xmlns:w14="http://schemas.microsoft.com/office/word/2010/wordml" xmlns:w15="http://schemas.microsoft.com/office/word/2012/wordml" xmlns:w16cex="http://schemas.microsoft.com/office/word/2018/wordml/cex" xmlns:w16cid="http://schemas.microsoft.com/office/word/2016/wordml/cid" xmlns:w16="http://schemas.microsoft.com/office/word/2018/wordml" xmlns:w16du="http://schemas.microsoft.com/office/word/2023/wordml/word16du" xmlns:w16sdtdh="http://schemas.microsoft.com/office/word/2020/wordml/sdtdatahash" xmlns:w16sdtfl="http://schemas.microsoft.com/office/word/2024/wordml/sdtformatlock" xmlns:w16se="http://schemas.microsoft.com/office/word/2015/wordml/symex" xmlns:wpg="http://schemas.microsoft.com/office/word/2010/wordprocessingGroup" xmlns:wpi="http://schemas.microsoft.com/office/word/2010/wordprocessingInk" xmlns:wne="http://schemas.microsoft.com/office/word/2006/wordml" xmlns:wps="http://schemas.microsoft.com/office/word/2010/wordprocessingShape" mc:Ignorable="w14 w15 w16se w16cid w16 w16cex w16sdtdh w16sdtfl w16du wp14">
+<w:document xmlns:wpc="http://schemas.microsoft.com/office/word/2010/wordprocessingCanvas" xmlns:cx="http://schemas.microsoft.com/office/drawing/2014/chartex" xmlns:cx1="http://schemas.microsoft.com/office/drawing/2015/9/8/chartex" xmlns:cx2="http://schemas.microsoft.com/office/drawing/2015/10/21/chartex" xmlns:cx3="http://schemas.microsoft.com/office/drawing/2016/5/9/chartex" xmlns:cx4="http://schemas.microsoft.com/office/drawing/2016/5/10/chartex" xmlns:cx5="http://schemas.microsoft.com/office/drawing/2016/5/11/chartex" xmlns:cx6="http://schemas.microsoft.com/office/drawing/2016/5/12/chartex" xmlns:cx7="http://schemas.microsoft.com/office/drawing/2016/5/13/chartex" xmlns:cx8="http://schemas.microsoft.com/office/drawing/2016/5/14/chartex" xmlns:mc="http://schemas.openxmlformats.org/markup-compatibility/2006" xmlns:aink="http://schemas.microsoft.com/office/drawing/2016/ink" xmlns:am3d="http://schemas.microsoft.com/office/drawing/2017/model3d" xmlns:o="urn:schemas-microsoft-com:office:office" xmlns:oel="http://schemas.microsoft.com/office/2019/extlst" xmlns:r="http://schemas.openxmlformats.org/officeDocument/2006/relationships" xmlns:m="http://schemas.openxmlformats.org/officeDocument/2006/math" xmlns:v="urn:schemas-microsoft-com:vml" xmlns:wp14="http://schemas.microsoft.com/office/word/2010/wordprocessingDrawing" xmlns:wp="http://schemas.openxmlformats.org/drawingml/2006/wordprocessingDrawing" xmlns:w10="urn:schemas-microsoft-com:office:word" xmlns:w="http://schemas.openxmlformats.org/wordprocessingml/2006/main" xmlns:w14="http://schemas.microsoft.com/office/word/2010/wordml" xmlns:w15="http://schemas.microsoft.com/office/word/2012/wordml" xmlns:w16cex="http://schemas.microsoft.com/office/word/2018/wordml/cex" xmlns:w16cid="http://schemas.microsoft.com/office/word/2016/wordml/cid" xmlns:w16="http://schemas.microsoft.com/office/word/2018/wordml" xmlns:w16sdtdh="http://schemas.microsoft.com/office/word/2020/wordml/sdtdatahash" xmlns:w16se="http://schemas.microsoft.com/office/word/2015/wordml/symex" xmlns:wpg="http://schemas.microsoft.com/office/word/2010/wordprocessingGroup" xmlns:wpi="http://schemas.microsoft.com/office/word/2010/wordprocessingInk" xmlns:wne="http://schemas.microsoft.com/office/word/2006/wordml" xmlns:wps="http://schemas.microsoft.com/office/word/2010/wordprocessingShape" mc:Ignorable="w14 w15 w16se w16cid w16 w16cex w16sdtdh wp14">
   <w:body>
     <w:p>
       <w:pPr>
@@ -269,39 +269,7 @@
           <w:szCs w:val="20"/>
           <w:highlight w:val="yellow"/>
         </w:rPr>
-        <w:t>[•]</w:t>
-      </w:r>
-      <w:r>
-        <w:rPr>
-          <w:rFonts w:eastAsia="Open Sans" w:cs="Open Sans"/>
-          <w:color w:val="000000"/>
-          <w:szCs w:val="20"/>
-        </w:rPr>
-        <w:t xml:space="preserve"> y representada para todos los efectos de este Contrato de </w:t>
-      </w:r>
-      <w:r>
-        <w:rPr>
-          <w:rFonts w:eastAsia="Open Sans" w:cs="Open Sans"/>
-          <w:color w:val="000000"/>
-          <w:szCs w:val="20"/>
-        </w:rPr>
-        <w:t>Mandato</w:t>
-      </w:r>
-      <w:r>
-        <w:rPr>
-          <w:rFonts w:eastAsia="Open Sans" w:cs="Open Sans"/>
-          <w:color w:val="000000"/>
-          <w:szCs w:val="20"/>
-        </w:rPr>
-        <w:t xml:space="preserve"> </w:t>
-      </w:r>
-      <w:r>
-        <w:rPr>
-          <w:rFonts w:eastAsia="Open Sans" w:cs="Open Sans"/>
-          <w:color w:val="000000"/>
-          <w:szCs w:val="20"/>
-        </w:rPr>
-        <w:t>por [</w:t>
+        <w:t>[</w:t>
       </w:r>
       <w:r>
         <w:rPr>
@@ -310,13 +278,63 @@
           <w:szCs w:val="20"/>
           <w:highlight w:val="yellow"/>
         </w:rPr>
-        <w:t>nombre del representante legal</w:t>
+        <w:t>NIT</w:t>
       </w:r>
       <w:r>
         <w:rPr>
           <w:rFonts w:eastAsia="Open Sans" w:cs="Open Sans"/>
           <w:color w:val="000000"/>
           <w:szCs w:val="20"/>
+          <w:highlight w:val="yellow"/>
+        </w:rPr>
+        <w:t>]</w:t>
+      </w:r>
+      <w:r>
+        <w:rPr>
+          <w:rFonts w:eastAsia="Open Sans" w:cs="Open Sans"/>
+          <w:color w:val="000000"/>
+          <w:szCs w:val="20"/>
+        </w:rPr>
+        <w:t xml:space="preserve"> y representada para todos los efectos de este Contrato de </w:t>
+      </w:r>
+      <w:r>
+        <w:rPr>
+          <w:rFonts w:eastAsia="Open Sans" w:cs="Open Sans"/>
+          <w:color w:val="000000"/>
+          <w:szCs w:val="20"/>
+        </w:rPr>
+        <w:t>Mandato</w:t>
+      </w:r>
+      <w:r>
+        <w:rPr>
+          <w:rFonts w:eastAsia="Open Sans" w:cs="Open Sans"/>
+          <w:color w:val="000000"/>
+          <w:szCs w:val="20"/>
+        </w:rPr>
+        <w:t xml:space="preserve"> </w:t>
+      </w:r>
+      <w:r>
+        <w:rPr>
+          <w:rFonts w:eastAsia="Open Sans" w:cs="Open Sans"/>
+          <w:color w:val="000000"/>
+          <w:szCs w:val="20"/>
+        </w:rPr>
+        <w:t>por [</w:t>
+      </w:r>
+      <w:r>
+        <w:rPr>
+          <w:rFonts w:eastAsia="Open Sans" w:cs="Open Sans"/>
+          <w:color w:val="000000"/>
+          <w:szCs w:val="20"/>
+          <w:highlight w:val="yellow"/>
+        </w:rPr>
+        <w:t>nombre del representante legal</w:t>
+      </w:r>
+      <w:r>
+        <w:rPr>
+          <w:rFonts w:eastAsia="Open Sans" w:cs="Open Sans"/>
+          <w:color w:val="000000"/>
+          <w:szCs w:val="20"/>
         </w:rPr>
         <w:t>], identificado como aparece al pie de su firma (el “</w:t>
       </w:r>
@@ -663,15 +681,7 @@
         <w:t xml:space="preserve">(según el mismo </w:t>
       </w:r>
       <w:r>
-        <w:t xml:space="preserve">sea </w:t>
-      </w:r>
-      <w:proofErr w:type="spellStart"/>
-      <w:r>
-        <w:t>re-expresado</w:t>
-      </w:r>
-      <w:proofErr w:type="spellEnd"/>
-      <w:r>
-        <w:t>, complementado o de cualquier manera modificado de tiempo en tiempo</w:t>
+        <w:t>sea re-expresado, complementado o de cualquier manera modificado de tiempo en tiempo</w:t>
       </w:r>
       <w:r>
         <w:t>)</w:t>
@@ -871,7 +881,7 @@
     </w:p>
     <w:p>
       <w:pPr>
-        <w:pStyle w:val="Heading1"/>
+        <w:pStyle w:val="Ttulo1"/>
       </w:pPr>
       <w:r>
         <w:lastRenderedPageBreak/>
@@ -881,7 +891,7 @@
     </w:p>
     <w:p>
       <w:pPr>
-        <w:pStyle w:val="Heading2"/>
+        <w:pStyle w:val="Ttulo2"/>
         <w:rPr>
           <w:vanish/>
           <w:specVanish/>
@@ -911,7 +921,7 @@
     </w:p>
     <w:p>
       <w:pPr>
-        <w:pStyle w:val="Heading3"/>
+        <w:pStyle w:val="Ttulo3"/>
       </w:pPr>
       <w:r>
         <w:t>Los términos con mayúscula inicial serán igualmente aplicables en singular y en plural. Las palabras “incluyendo”, “incluye” e “incluir” se considerarán seguidas de la frase “sin limitación alguna”. Las palabras técnicas que no se encuentren definidas expresamente en este Contrato</w:t>
@@ -925,7 +935,7 @@
     </w:p>
     <w:p>
       <w:pPr>
-        <w:pStyle w:val="Heading3"/>
+        <w:pStyle w:val="Ttulo3"/>
       </w:pPr>
       <w:r>
         <w:t>Las referencias a este Contrato</w:t>
@@ -951,7 +961,7 @@
     </w:p>
     <w:p>
       <w:pPr>
-        <w:pStyle w:val="Heading3"/>
+        <w:pStyle w:val="Ttulo3"/>
       </w:pPr>
       <w:r>
         <w:t>Las referencias a las Leyes Aplicables incluyen todas las Leyes Aplicables o disposiciones legales, tal y como hayan sido modificadas, adicionadas o remplazadas en cualquier momento.</w:t>
@@ -959,7 +969,7 @@
     </w:p>
     <w:p>
       <w:pPr>
-        <w:pStyle w:val="Heading3"/>
+        <w:pStyle w:val="Ttulo3"/>
       </w:pPr>
       <w:r>
         <w:t>Las Partes han tenido la oportunidad de revisar y analizar el presente Contrato</w:t>
@@ -974,15 +984,7 @@
         <w:t>Apéndices</w:t>
       </w:r>
       <w:r>
-        <w:t xml:space="preserve"> antes de su suscripción y antes de obligarse en los términos </w:t>
-      </w:r>
-      <w:proofErr w:type="gramStart"/>
-      <w:r>
-        <w:t>del mismo</w:t>
-      </w:r>
-      <w:proofErr w:type="gramEnd"/>
-      <w:r>
-        <w:t>. En caso de ambigüedad o duda en relación con la intención o interpretación de cualquier disposición de este Contrato</w:t>
+        <w:t xml:space="preserve"> antes de su suscripción y antes de obligarse en los términos del mismo. En caso de ambigüedad o duda en relación con la intención o interpretación de cualquier disposición de este Contrato</w:t>
       </w:r>
       <w:r>
         <w:t xml:space="preserve"> de Mandato</w:t>
@@ -993,7 +995,7 @@
     </w:p>
     <w:p>
       <w:pPr>
-        <w:pStyle w:val="Heading2"/>
+        <w:pStyle w:val="Ttulo2"/>
         <w:rPr>
           <w:vanish/>
           <w:specVanish/>
@@ -1528,7 +1530,7 @@
     </w:p>
     <w:p>
       <w:pPr>
-        <w:pStyle w:val="Heading1"/>
+        <w:pStyle w:val="Ttulo1"/>
       </w:pPr>
       <w:r>
         <w:br/>
@@ -1552,7 +1554,7 @@
     </w:p>
     <w:p>
       <w:pPr>
-        <w:pStyle w:val="Heading2"/>
+        <w:pStyle w:val="Ttulo2"/>
         <w:rPr>
           <w:vanish/>
           <w:specVanish/>
@@ -1691,7 +1693,7 @@
     </w:p>
     <w:p>
       <w:pPr>
-        <w:pStyle w:val="Heading2"/>
+        <w:pStyle w:val="Ttulo2"/>
         <w:rPr>
           <w:vanish/>
           <w:specVanish/>
@@ -1734,7 +1736,7 @@
     </w:p>
     <w:p>
       <w:pPr>
-        <w:pStyle w:val="Heading3"/>
+        <w:pStyle w:val="Ttulo3"/>
       </w:pPr>
       <w:bookmarkStart w:id="7" w:name="_Ref175764092"/>
       <w:r>
@@ -1771,15 +1773,7 @@
         <w:t>”),</w:t>
       </w:r>
       <w:r>
-        <w:t xml:space="preserve"> debidamente suscrita por un </w:t>
-      </w:r>
-      <w:proofErr w:type="gramStart"/>
-      <w:r>
-        <w:t>Funcionario</w:t>
-      </w:r>
-      <w:proofErr w:type="gramEnd"/>
-      <w:r>
-        <w:t xml:space="preserve"> Autorizado del Mandante,</w:t>
+        <w:t xml:space="preserve"> debidamente suscrita por un Funcionario Autorizado del Mandante,</w:t>
       </w:r>
       <w:r>
         <w:t xml:space="preserve"> en la cual se </w:t>
@@ -1833,7 +1827,7 @@
     </w:p>
     <w:p>
       <w:pPr>
-        <w:pStyle w:val="Heading3"/>
+        <w:pStyle w:val="Ttulo3"/>
       </w:pPr>
       <w:r>
         <w:t>Copia del Instrumento de Pago</w:t>
@@ -1844,7 +1838,7 @@
     </w:p>
     <w:p>
       <w:pPr>
-        <w:pStyle w:val="Heading3"/>
+        <w:pStyle w:val="Ttulo3"/>
       </w:pPr>
       <w:r>
         <w:t>Toda la</w:t>
@@ -1873,7 +1867,7 @@
     </w:p>
     <w:p>
       <w:pPr>
-        <w:pStyle w:val="Heading2"/>
+        <w:pStyle w:val="Ttulo2"/>
         <w:rPr>
           <w:vanish/>
           <w:u w:val="none"/>
@@ -2164,7 +2158,7 @@
     </w:p>
     <w:p>
       <w:pPr>
-        <w:pStyle w:val="Heading1"/>
+        <w:pStyle w:val="Ttulo1"/>
       </w:pPr>
       <w:r>
         <w:br/>
@@ -2182,7 +2176,7 @@
     </w:p>
     <w:p>
       <w:pPr>
-        <w:pStyle w:val="Heading2"/>
+        <w:pStyle w:val="Ttulo2"/>
         <w:rPr>
           <w:vanish/>
           <w:specVanish/>
@@ -2294,7 +2288,7 @@
     </w:p>
     <w:p>
       <w:pPr>
-        <w:pStyle w:val="Heading2"/>
+        <w:pStyle w:val="Ttulo2"/>
         <w:rPr>
           <w:vanish/>
           <w:specVanish/>
@@ -2428,7 +2422,7 @@
     </w:p>
     <w:p>
       <w:pPr>
-        <w:pStyle w:val="Heading2"/>
+        <w:pStyle w:val="Ttulo2"/>
         <w:rPr>
           <w:vanish/>
           <w:specVanish/>
@@ -2468,7 +2462,7 @@
     </w:p>
     <w:p>
       <w:pPr>
-        <w:pStyle w:val="Heading2"/>
+        <w:pStyle w:val="Ttulo2"/>
         <w:rPr>
           <w:vanish/>
           <w:specVanish/>
@@ -2503,7 +2497,7 @@
     </w:p>
     <w:p>
       <w:pPr>
-        <w:pStyle w:val="Heading1"/>
+        <w:pStyle w:val="Ttulo1"/>
       </w:pPr>
       <w:r>
         <w:br/>
@@ -2512,7 +2506,7 @@
     </w:p>
     <w:p>
       <w:pPr>
-        <w:pStyle w:val="Heading2"/>
+        <w:pStyle w:val="Ttulo2"/>
         <w:rPr>
           <w:vanish/>
           <w:specVanish/>
@@ -2565,7 +2559,7 @@
     </w:p>
     <w:p>
       <w:pPr>
-        <w:pStyle w:val="Heading3"/>
+        <w:pStyle w:val="Ttulo3"/>
       </w:pPr>
       <w:r>
         <w:t>P</w:t>
@@ -2603,7 +2597,7 @@
     </w:p>
     <w:p>
       <w:pPr>
-        <w:pStyle w:val="Heading3"/>
+        <w:pStyle w:val="Ttulo3"/>
       </w:pPr>
       <w:r>
         <w:t>R</w:t>
@@ -2635,7 +2629,7 @@
     </w:p>
     <w:p>
       <w:pPr>
-        <w:pStyle w:val="Heading3"/>
+        <w:pStyle w:val="Ttulo3"/>
       </w:pPr>
       <w:r>
         <w:t>I</w:t>
@@ -2661,7 +2655,7 @@
     </w:p>
     <w:p>
       <w:pPr>
-        <w:pStyle w:val="Heading2"/>
+        <w:pStyle w:val="Ttulo2"/>
         <w:rPr>
           <w:vanish/>
           <w:specVanish/>
@@ -2702,7 +2696,7 @@
     </w:p>
     <w:p>
       <w:pPr>
-        <w:pStyle w:val="Heading1"/>
+        <w:pStyle w:val="Ttulo1"/>
       </w:pPr>
       <w:r>
         <w:br/>
@@ -2797,7 +2791,7 @@
     </w:p>
     <w:p>
       <w:pPr>
-        <w:pStyle w:val="Heading1"/>
+        <w:pStyle w:val="Ttulo1"/>
       </w:pPr>
       <w:r>
         <w:br/>
@@ -2818,7 +2812,7 @@
     </w:p>
     <w:p>
       <w:pPr>
-        <w:pStyle w:val="Heading2"/>
+        <w:pStyle w:val="Ttulo2"/>
         <w:rPr>
           <w:vanish/>
           <w:specVanish/>
@@ -2901,7 +2895,7 @@
     </w:p>
     <w:p>
       <w:pPr>
-        <w:pStyle w:val="Heading2"/>
+        <w:pStyle w:val="Ttulo2"/>
         <w:rPr>
           <w:vanish/>
           <w:u w:val="none"/>
@@ -2920,7 +2914,7 @@
     </w:p>
     <w:p>
       <w:pPr>
-        <w:pStyle w:val="Heading2"/>
+        <w:pStyle w:val="Ttulo2"/>
         <w:rPr>
           <w:u w:val="none"/>
         </w:rPr>
@@ -3054,7 +3048,7 @@
     </w:p>
     <w:p>
       <w:pPr>
-        <w:pStyle w:val="Heading1"/>
+        <w:pStyle w:val="Ttulo1"/>
       </w:pPr>
       <w:r>
         <w:br/>
@@ -3074,7 +3068,7 @@
     </w:p>
     <w:p>
       <w:pPr>
-        <w:pStyle w:val="Heading2"/>
+        <w:pStyle w:val="Ttulo2"/>
         <w:rPr>
           <w:vanish/>
           <w:specVanish/>
@@ -3144,7 +3138,7 @@
     </w:p>
     <w:p>
       <w:pPr>
-        <w:pStyle w:val="Heading2"/>
+        <w:pStyle w:val="Ttulo2"/>
         <w:rPr>
           <w:vanish/>
           <w:u w:val="none"/>
@@ -3160,7 +3154,7 @@
     </w:p>
     <w:p>
       <w:pPr>
-        <w:pStyle w:val="Heading2"/>
+        <w:pStyle w:val="Ttulo2"/>
         <w:rPr>
           <w:u w:val="none"/>
         </w:rPr>
@@ -3288,7 +3282,7 @@
     </w:p>
     <w:p>
       <w:pPr>
-        <w:pStyle w:val="Heading1"/>
+        <w:pStyle w:val="Ttulo1"/>
       </w:pPr>
       <w:r>
         <w:br/>
@@ -3299,7 +3293,7 @@
     </w:p>
     <w:p>
       <w:pPr>
-        <w:pStyle w:val="Heading2"/>
+        <w:pStyle w:val="Ttulo2"/>
         <w:rPr>
           <w:vanish/>
           <w:specVanish/>
@@ -3316,7 +3310,7 @@
     </w:p>
     <w:p>
       <w:pPr>
-        <w:pStyle w:val="Heading2"/>
+        <w:pStyle w:val="Ttulo2"/>
         <w:rPr>
           <w:vanish/>
           <w:specVanish/>
@@ -3343,15 +3337,7 @@
         <w:t>Mandato</w:t>
       </w:r>
       <w:r>
-        <w:t xml:space="preserve">, serán válidas cuando consten por escrito y estén debidamente firmadas por los </w:t>
-      </w:r>
-      <w:proofErr w:type="gramStart"/>
-      <w:r>
-        <w:t>Funcionarios</w:t>
-      </w:r>
-      <w:proofErr w:type="gramEnd"/>
-      <w:r>
-        <w:t xml:space="preserve"> Autorizados de cada una de las Partes. Las Partes convienen en que, </w:t>
+        <w:t xml:space="preserve">, serán válidas cuando consten por escrito y estén debidamente firmadas por los Funcionarios Autorizados de cada una de las Partes. Las Partes convienen en que, </w:t>
       </w:r>
       <w:r>
         <w:t xml:space="preserve">salvo que se exprese lo contrario en este Contrato de Mandato, </w:t>
@@ -3368,7 +3354,7 @@
     </w:p>
     <w:p>
       <w:pPr>
-        <w:pStyle w:val="Heading2"/>
+        <w:pStyle w:val="Ttulo2"/>
         <w:rPr>
           <w:vanish/>
           <w:specVanish/>
@@ -3423,7 +3409,7 @@
     </w:p>
     <w:p>
       <w:pPr>
-        <w:pStyle w:val="Heading2"/>
+        <w:pStyle w:val="Ttulo2"/>
         <w:rPr>
           <w:vanish/>
           <w:specVanish/>
@@ -3456,7 +3442,7 @@
     </w:p>
     <w:p>
       <w:pPr>
-        <w:pStyle w:val="Heading2"/>
+        <w:pStyle w:val="Ttulo2"/>
         <w:rPr>
           <w:vanish/>
           <w:specVanish/>
@@ -3485,7 +3471,7 @@
     </w:p>
     <w:p>
       <w:pPr>
-        <w:pStyle w:val="Heading2"/>
+        <w:pStyle w:val="Ttulo2"/>
         <w:rPr>
           <w:vanish/>
           <w:specVanish/>
@@ -3547,7 +3533,7 @@
     </w:p>
     <w:p>
       <w:pPr>
-        <w:pStyle w:val="Heading2"/>
+        <w:pStyle w:val="Ttulo2"/>
         <w:rPr>
           <w:vanish/>
           <w:specVanish/>
@@ -3587,7 +3573,7 @@
     </w:p>
     <w:p>
       <w:pPr>
-        <w:pStyle w:val="Heading2"/>
+        <w:pStyle w:val="Ttulo2"/>
         <w:rPr>
           <w:vanish/>
           <w:specVanish/>
@@ -3599,7 +3585,7 @@
     </w:p>
     <w:p>
       <w:pPr>
-        <w:pStyle w:val="Heading2"/>
+        <w:pStyle w:val="Ttulo2"/>
         <w:rPr>
           <w:u w:val="none"/>
         </w:rPr>
@@ -3638,16 +3624,8 @@
         <w:rPr>
           <w:u w:val="none"/>
         </w:rPr>
-        <w:t xml:space="preserve">, incluyendo los que se incorporen con posterioridad a la firma </w:t>
-      </w:r>
-      <w:proofErr w:type="gramStart"/>
-      <w:r>
-        <w:rPr>
-          <w:u w:val="none"/>
-        </w:rPr>
-        <w:t>del mismo</w:t>
-      </w:r>
-      <w:proofErr w:type="gramEnd"/>
+        <w:t>, incluyendo los que se incorporen con posterioridad a la firma del mismo</w:t>
+      </w:r>
       <w:r>
         <w:rPr>
           <w:u w:val="none"/>
@@ -4077,9 +4055,25 @@
                 <w:rFonts w:ascii="Open Sans" w:hAnsi="Open Sans" w:cs="Open Sans"/>
                 <w:sz w:val="20"/>
                 <w:szCs w:val="20"/>
+              </w:rPr>
+              <w:t>[</w:t>
+            </w:r>
+            <w:r>
+              <w:rPr>
+                <w:rFonts w:ascii="Open Sans" w:hAnsi="Open Sans" w:cs="Open Sans"/>
+                <w:sz w:val="20"/>
+                <w:szCs w:val="20"/>
                 <w:highlight w:val="yellow"/>
               </w:rPr>
-              <w:t>[•]</w:t>
+              <w:t>número de documento del representante legal</w:t>
+            </w:r>
+            <w:r>
+              <w:rPr>
+                <w:rFonts w:ascii="Open Sans" w:hAnsi="Open Sans" w:cs="Open Sans"/>
+                <w:sz w:val="20"/>
+                <w:szCs w:val="20"/>
+              </w:rPr>
+              <w:t>]</w:t>
             </w:r>
             <w:r>
               <w:rPr>
@@ -4108,7 +4102,7 @@
     </w:p>
     <w:p>
       <w:pPr>
-        <w:pStyle w:val="Heading1"/>
+        <w:pStyle w:val="Ttulo1"/>
         <w:numPr>
           <w:ilvl w:val="0"/>
           <w:numId w:val="0"/>
@@ -4171,7 +4165,7 @@
     </w:p>
     <w:p>
       <w:pPr>
-        <w:pStyle w:val="Heading1"/>
+        <w:pStyle w:val="Ttulo1"/>
         <w:numPr>
           <w:ilvl w:val="0"/>
           <w:numId w:val="0"/>
@@ -4196,7 +4190,7 @@
     </w:p>
     <w:tbl>
       <w:tblPr>
-        <w:tblStyle w:val="TableGrid"/>
+        <w:tblStyle w:val="Tablaconcuadrcula"/>
         <w:tblW w:w="0" w:type="auto"/>
         <w:tblCellMar>
           <w:top w:w="28" w:type="dxa"/>
@@ -4692,7 +4686,7 @@
             <w:commentRangeEnd w:id="15"/>
             <w:r>
               <w:rPr>
-                <w:rStyle w:val="CommentReference"/>
+                <w:rStyle w:val="Refdecomentario"/>
               </w:rPr>
               <w:commentReference w:id="15"/>
             </w:r>
@@ -4924,7 +4918,7 @@
           </w:p>
           <w:tbl>
             <w:tblPr>
-              <w:tblStyle w:val="TableGrid"/>
+              <w:tblStyle w:val="Tablaconcuadrcula"/>
               <w:tblW w:w="0" w:type="auto"/>
               <w:tblCellMar>
                 <w:top w:w="28" w:type="dxa"/>
@@ -6105,7 +6099,7 @@
           </w:tcPr>
           <w:p>
             <w:pPr>
-              <w:pStyle w:val="ListParagraph"/>
+              <w:pStyle w:val="Prrafodelista"/>
               <w:numPr>
                 <w:ilvl w:val="0"/>
                 <w:numId w:val="34"/>
@@ -6144,7 +6138,7 @@
           </w:p>
           <w:p>
             <w:pPr>
-              <w:pStyle w:val="ListParagraph"/>
+              <w:pStyle w:val="Prrafodelista"/>
               <w:numPr>
                 <w:ilvl w:val="0"/>
                 <w:numId w:val="34"/>
@@ -6183,7 +6177,7 @@
           </w:p>
           <w:p>
             <w:pPr>
-              <w:pStyle w:val="ListParagraph"/>
+              <w:pStyle w:val="Prrafodelista"/>
               <w:numPr>
                 <w:ilvl w:val="1"/>
                 <w:numId w:val="34"/>
@@ -6286,7 +6280,7 @@
           </w:p>
           <w:p>
             <w:pPr>
-              <w:pStyle w:val="ListParagraph"/>
+              <w:pStyle w:val="Prrafodelista"/>
               <w:numPr>
                 <w:ilvl w:val="1"/>
                 <w:numId w:val="34"/>
@@ -6372,7 +6366,7 @@
           </w:p>
           <w:p>
             <w:pPr>
-              <w:pStyle w:val="ListParagraph"/>
+              <w:pStyle w:val="Prrafodelista"/>
               <w:numPr>
                 <w:ilvl w:val="0"/>
                 <w:numId w:val="34"/>
@@ -6466,7 +6460,7 @@
           </w:p>
           <w:p>
             <w:pPr>
-              <w:pStyle w:val="ListParagraph"/>
+              <w:pStyle w:val="Prrafodelista"/>
               <w:numPr>
                 <w:ilvl w:val="0"/>
                 <w:numId w:val="34"/>
@@ -6579,9 +6573,25 @@
                 <w:rFonts w:cs="Open Sans"/>
                 <w:sz w:val="18"/>
                 <w:szCs w:val="18"/>
+              </w:rPr>
+              <w:t xml:space="preserve"> </w:t>
+            </w:r>
+            <w:r>
+              <w:rPr>
+                <w:rFonts w:cs="Open Sans"/>
+                <w:sz w:val="18"/>
+                <w:szCs w:val="18"/>
                 <w:highlight w:val="lightGray"/>
               </w:rPr>
               <w:t>Nombre del representante legal</w:t>
+            </w:r>
+            <w:r>
+              <w:rPr>
+                <w:rFonts w:cs="Open Sans"/>
+                <w:sz w:val="18"/>
+                <w:szCs w:val="18"/>
+              </w:rPr>
+              <w:t xml:space="preserve"> </w:t>
             </w:r>
             <w:r>
               <w:rPr>
@@ -6613,6 +6623,14 @@
                 <w:rFonts w:cs="Open Sans"/>
                 <w:sz w:val="18"/>
                 <w:szCs w:val="18"/>
+              </w:rPr>
+              <w:t xml:space="preserve"> </w:t>
+            </w:r>
+            <w:r>
+              <w:rPr>
+                <w:rFonts w:cs="Open Sans"/>
+                <w:sz w:val="18"/>
+                <w:szCs w:val="18"/>
                 <w:highlight w:val="lightGray"/>
               </w:rPr>
               <w:t>tipo de identificación</w:t>
@@ -6623,6 +6641,14 @@
                 <w:sz w:val="18"/>
                 <w:szCs w:val="18"/>
               </w:rPr>
+              <w:t xml:space="preserve"> </w:t>
+            </w:r>
+            <w:r>
+              <w:rPr>
+                <w:rFonts w:cs="Open Sans"/>
+                <w:sz w:val="18"/>
+                <w:szCs w:val="18"/>
+              </w:rPr>
               <w:t xml:space="preserve">] No. </w:t>
             </w:r>
             <w:r>
@@ -6632,7 +6658,43 @@
                 <w:szCs w:val="18"/>
                 <w:highlight w:val="lightGray"/>
               </w:rPr>
-              <w:t>[•]</w:t>
+              <w:t>[</w:t>
+            </w:r>
+            <w:r>
+              <w:rPr>
+                <w:rFonts w:cs="Open Sans"/>
+                <w:sz w:val="18"/>
+                <w:szCs w:val="18"/>
+                <w:highlight w:val="lightGray"/>
+              </w:rPr>
+              <w:t xml:space="preserve"> </w:t>
+            </w:r>
+            <w:r>
+              <w:rPr>
+                <w:rFonts w:cs="Open Sans"/>
+                <w:sz w:val="18"/>
+                <w:szCs w:val="18"/>
+                <w:highlight w:val="lightGray"/>
+              </w:rPr>
+              <w:t>•</w:t>
+            </w:r>
+            <w:r>
+              <w:rPr>
+                <w:rFonts w:cs="Open Sans"/>
+                <w:sz w:val="18"/>
+                <w:szCs w:val="18"/>
+                <w:highlight w:val="lightGray"/>
+              </w:rPr>
+              <w:t xml:space="preserve"> </w:t>
+            </w:r>
+            <w:r>
+              <w:rPr>
+                <w:rFonts w:cs="Open Sans"/>
+                <w:sz w:val="18"/>
+                <w:szCs w:val="18"/>
+                <w:highlight w:val="lightGray"/>
+              </w:rPr>
+              <w:t>]</w:t>
             </w:r>
             <w:r>
               <w:rPr>
@@ -6668,16 +6730,16 @@
 </file>
 
 <file path=word/comments.xml><?xml version="1.0" encoding="utf-8"?>
-<w:comments xmlns:wpc="http://schemas.microsoft.com/office/word/2010/wordprocessingCanvas" xmlns:cx="http://schemas.microsoft.com/office/drawing/2014/chartex" xmlns:cx1="http://schemas.microsoft.com/office/drawing/2015/9/8/chartex" xmlns:cx2="http://schemas.microsoft.com/office/drawing/2015/10/21/chartex" xmlns:cx3="http://schemas.microsoft.com/office/drawing/2016/5/9/chartex" xmlns:cx4="http://schemas.microsoft.com/office/drawing/2016/5/10/chartex" xmlns:cx5="http://schemas.microsoft.com/office/drawing/2016/5/11/chartex" xmlns:cx6="http://schemas.microsoft.com/office/drawing/2016/5/12/chartex" xmlns:cx7="http://schemas.microsoft.com/office/drawing/2016/5/13/chartex" xmlns:cx8="http://schemas.microsoft.com/office/drawing/2016/5/14/chartex" xmlns:mc="http://schemas.openxmlformats.org/markup-compatibility/2006" xmlns:aink="http://schemas.microsoft.com/office/drawing/2016/ink" xmlns:am3d="http://schemas.microsoft.com/office/drawing/2017/model3d" xmlns:o="urn:schemas-microsoft-com:office:office" xmlns:oel="http://schemas.microsoft.com/office/2019/extlst" xmlns:r="http://schemas.openxmlformats.org/officeDocument/2006/relationships" xmlns:m="http://schemas.openxmlformats.org/officeDocument/2006/math" xmlns:v="urn:schemas-microsoft-com:vml" xmlns:wp14="http://schemas.microsoft.com/office/word/2010/wordprocessingDrawing" xmlns:wp="http://schemas.openxmlformats.org/drawingml/2006/wordprocessingDrawing" xmlns:w10="urn:schemas-microsoft-com:office:word" xmlns:w="http://schemas.openxmlformats.org/wordprocessingml/2006/main" xmlns:w14="http://schemas.microsoft.com/office/word/2010/wordml" xmlns:w15="http://schemas.microsoft.com/office/word/2012/wordml" xmlns:w16cex="http://schemas.microsoft.com/office/word/2018/wordml/cex" xmlns:w16cid="http://schemas.microsoft.com/office/word/2016/wordml/cid" xmlns:w16="http://schemas.microsoft.com/office/word/2018/wordml" xmlns:w16du="http://schemas.microsoft.com/office/word/2023/wordml/word16du" xmlns:w16sdtdh="http://schemas.microsoft.com/office/word/2020/wordml/sdtdatahash" xmlns:w16sdtfl="http://schemas.microsoft.com/office/word/2024/wordml/sdtformatlock" xmlns:w16se="http://schemas.microsoft.com/office/word/2015/wordml/symex" xmlns:wpg="http://schemas.microsoft.com/office/word/2010/wordprocessingGroup" xmlns:wpi="http://schemas.microsoft.com/office/word/2010/wordprocessingInk" xmlns:wne="http://schemas.microsoft.com/office/word/2006/wordml" xmlns:wps="http://schemas.microsoft.com/office/word/2010/wordprocessingShape" mc:Ignorable="w14 w15 w16se w16cid w16 w16cex w16sdtdh w16sdtfl w16du wp14">
+<w:comments xmlns:wpc="http://schemas.microsoft.com/office/word/2010/wordprocessingCanvas" xmlns:cx="http://schemas.microsoft.com/office/drawing/2014/chartex" xmlns:cx1="http://schemas.microsoft.com/office/drawing/2015/9/8/chartex" xmlns:cx2="http://schemas.microsoft.com/office/drawing/2015/10/21/chartex" xmlns:cx3="http://schemas.microsoft.com/office/drawing/2016/5/9/chartex" xmlns:cx4="http://schemas.microsoft.com/office/drawing/2016/5/10/chartex" xmlns:cx5="http://schemas.microsoft.com/office/drawing/2016/5/11/chartex" xmlns:cx6="http://schemas.microsoft.com/office/drawing/2016/5/12/chartex" xmlns:cx7="http://schemas.microsoft.com/office/drawing/2016/5/13/chartex" xmlns:cx8="http://schemas.microsoft.com/office/drawing/2016/5/14/chartex" xmlns:mc="http://schemas.openxmlformats.org/markup-compatibility/2006" xmlns:aink="http://schemas.microsoft.com/office/drawing/2016/ink" xmlns:am3d="http://schemas.microsoft.com/office/drawing/2017/model3d" xmlns:o="urn:schemas-microsoft-com:office:office" xmlns:oel="http://schemas.microsoft.com/office/2019/extlst" xmlns:r="http://schemas.openxmlformats.org/officeDocument/2006/relationships" xmlns:m="http://schemas.openxmlformats.org/officeDocument/2006/math" xmlns:v="urn:schemas-microsoft-com:vml" xmlns:wp14="http://schemas.microsoft.com/office/word/2010/wordprocessingDrawing" xmlns:wp="http://schemas.openxmlformats.org/drawingml/2006/wordprocessingDrawing" xmlns:w10="urn:schemas-microsoft-com:office:word" xmlns:w="http://schemas.openxmlformats.org/wordprocessingml/2006/main" xmlns:w14="http://schemas.microsoft.com/office/word/2010/wordml" xmlns:w15="http://schemas.microsoft.com/office/word/2012/wordml" xmlns:w16cex="http://schemas.microsoft.com/office/word/2018/wordml/cex" xmlns:w16cid="http://schemas.microsoft.com/office/word/2016/wordml/cid" xmlns:w16="http://schemas.microsoft.com/office/word/2018/wordml" xmlns:w16sdtdh="http://schemas.microsoft.com/office/word/2020/wordml/sdtdatahash" xmlns:w16se="http://schemas.microsoft.com/office/word/2015/wordml/symex" xmlns:wpg="http://schemas.microsoft.com/office/word/2010/wordprocessingGroup" xmlns:wpi="http://schemas.microsoft.com/office/word/2010/wordprocessingInk" xmlns:wne="http://schemas.microsoft.com/office/word/2006/wordml" xmlns:wps="http://schemas.microsoft.com/office/word/2010/wordprocessingShape" mc:Ignorable="w14 w15 w16se w16cid w16 w16cex w16sdtdh wp14">
   <w:comment w:id="15" w:author="Sofia Tobon -FK" w:date="2025-12-01T07:49:00Z" w:initials="ST">
     <w:p>
       <w:pPr>
-        <w:pStyle w:val="CommentText"/>
+        <w:pStyle w:val="Textocomentario"/>
         <w:jc w:val="left"/>
       </w:pPr>
       <w:r>
         <w:rPr>
-          <w:rStyle w:val="CommentReference"/>
+          <w:rStyle w:val="Refdecomentario"/>
         </w:rPr>
         <w:annotationRef/>
       </w:r>
@@ -6730,25 +6792,25 @@
 </file>
 
 <file path=word/commentsExtended.xml><?xml version="1.0" encoding="utf-8"?>
-<w15:commentsEx xmlns:wpc="http://schemas.microsoft.com/office/word/2010/wordprocessingCanvas" xmlns:cx="http://schemas.microsoft.com/office/drawing/2014/chartex" xmlns:cx1="http://schemas.microsoft.com/office/drawing/2015/9/8/chartex" xmlns:cx2="http://schemas.microsoft.com/office/drawing/2015/10/21/chartex" xmlns:cx3="http://schemas.microsoft.com/office/drawing/2016/5/9/chartex" xmlns:cx4="http://schemas.microsoft.com/office/drawing/2016/5/10/chartex" xmlns:cx5="http://schemas.microsoft.com/office/drawing/2016/5/11/chartex" xmlns:cx6="http://schemas.microsoft.com/office/drawing/2016/5/12/chartex" xmlns:cx7="http://schemas.microsoft.com/office/drawing/2016/5/13/chartex" xmlns:cx8="http://schemas.microsoft.com/office/drawing/2016/5/14/chartex" xmlns:mc="http://schemas.openxmlformats.org/markup-compatibility/2006" xmlns:aink="http://schemas.microsoft.com/office/drawing/2016/ink" xmlns:am3d="http://schemas.microsoft.com/office/drawing/2017/model3d" xmlns:o="urn:schemas-microsoft-com:office:office" xmlns:oel="http://schemas.microsoft.com/office/2019/extlst" xmlns:r="http://schemas.openxmlformats.org/officeDocument/2006/relationships" xmlns:m="http://schemas.openxmlformats.org/officeDocument/2006/math" xmlns:v="urn:schemas-microsoft-com:vml" xmlns:wp14="http://schemas.microsoft.com/office/word/2010/wordprocessingDrawing" xmlns:wp="http://schemas.openxmlformats.org/drawingml/2006/wordprocessingDrawing" xmlns:w10="urn:schemas-microsoft-com:office:word" xmlns:w="http://schemas.openxmlformats.org/wordprocessingml/2006/main" xmlns:w14="http://schemas.microsoft.com/office/word/2010/wordml" xmlns:w15="http://schemas.microsoft.com/office/word/2012/wordml" xmlns:w16cex="http://schemas.microsoft.com/office/word/2018/wordml/cex" xmlns:w16cid="http://schemas.microsoft.com/office/word/2016/wordml/cid" xmlns:w16="http://schemas.microsoft.com/office/word/2018/wordml" xmlns:w16du="http://schemas.microsoft.com/office/word/2023/wordml/word16du" xmlns:w16sdtdh="http://schemas.microsoft.com/office/word/2020/wordml/sdtdatahash" xmlns:w16sdtfl="http://schemas.microsoft.com/office/word/2024/wordml/sdtformatlock" xmlns:w16se="http://schemas.microsoft.com/office/word/2015/wordml/symex" xmlns:wpg="http://schemas.microsoft.com/office/word/2010/wordprocessingGroup" xmlns:wpi="http://schemas.microsoft.com/office/word/2010/wordprocessingInk" xmlns:wne="http://schemas.microsoft.com/office/word/2006/wordml" xmlns:wps="http://schemas.microsoft.com/office/word/2010/wordprocessingShape" mc:Ignorable="w14 w15 w16se w16cid w16 w16cex w16sdtdh w16sdtfl w16du wp14">
+<w15:commentsEx xmlns:wpc="http://schemas.microsoft.com/office/word/2010/wordprocessingCanvas" xmlns:cx="http://schemas.microsoft.com/office/drawing/2014/chartex" xmlns:cx1="http://schemas.microsoft.com/office/drawing/2015/9/8/chartex" xmlns:cx2="http://schemas.microsoft.com/office/drawing/2015/10/21/chartex" xmlns:cx3="http://schemas.microsoft.com/office/drawing/2016/5/9/chartex" xmlns:cx4="http://schemas.microsoft.com/office/drawing/2016/5/10/chartex" xmlns:cx5="http://schemas.microsoft.com/office/drawing/2016/5/11/chartex" xmlns:cx6="http://schemas.microsoft.com/office/drawing/2016/5/12/chartex" xmlns:cx7="http://schemas.microsoft.com/office/drawing/2016/5/13/chartex" xmlns:cx8="http://schemas.microsoft.com/office/drawing/2016/5/14/chartex" xmlns:mc="http://schemas.openxmlformats.org/markup-compatibility/2006" xmlns:aink="http://schemas.microsoft.com/office/drawing/2016/ink" xmlns:am3d="http://schemas.microsoft.com/office/drawing/2017/model3d" xmlns:o="urn:schemas-microsoft-com:office:office" xmlns:oel="http://schemas.microsoft.com/office/2019/extlst" xmlns:r="http://schemas.openxmlformats.org/officeDocument/2006/relationships" xmlns:m="http://schemas.openxmlformats.org/officeDocument/2006/math" xmlns:v="urn:schemas-microsoft-com:vml" xmlns:wp14="http://schemas.microsoft.com/office/word/2010/wordprocessingDrawing" xmlns:wp="http://schemas.openxmlformats.org/drawingml/2006/wordprocessingDrawing" xmlns:w10="urn:schemas-microsoft-com:office:word" xmlns:w="http://schemas.openxmlformats.org/wordprocessingml/2006/main" xmlns:w14="http://schemas.microsoft.com/office/word/2010/wordml" xmlns:w15="http://schemas.microsoft.com/office/word/2012/wordml" xmlns:w16cex="http://schemas.microsoft.com/office/word/2018/wordml/cex" xmlns:w16cid="http://schemas.microsoft.com/office/word/2016/wordml/cid" xmlns:w16="http://schemas.microsoft.com/office/word/2018/wordml" xmlns:w16sdtdh="http://schemas.microsoft.com/office/word/2020/wordml/sdtdatahash" xmlns:w16se="http://schemas.microsoft.com/office/word/2015/wordml/symex" xmlns:wpg="http://schemas.microsoft.com/office/word/2010/wordprocessingGroup" xmlns:wpi="http://schemas.microsoft.com/office/word/2010/wordprocessingInk" xmlns:wne="http://schemas.microsoft.com/office/word/2006/wordml" xmlns:wps="http://schemas.microsoft.com/office/word/2010/wordprocessingShape" mc:Ignorable="w14 w15 w16se w16cid w16 w16cex w16sdtdh wp14">
   <w15:commentEx w15:paraId="234C601F" w15:done="0"/>
 </w15:commentsEx>
 </file>
 
 <file path=word/commentsExtensible.xml><?xml version="1.0" encoding="utf-8"?>
-<w16cex:commentsExtensible xmlns:wpc="http://schemas.microsoft.com/office/word/2010/wordprocessingCanvas" xmlns:cx="http://schemas.microsoft.com/office/drawing/2014/chartex" xmlns:cx1="http://schemas.microsoft.com/office/drawing/2015/9/8/chartex" xmlns:cx2="http://schemas.microsoft.com/office/drawing/2015/10/21/chartex" xmlns:cx3="http://schemas.microsoft.com/office/drawing/2016/5/9/chartex" xmlns:cx4="http://schemas.microsoft.com/office/drawing/2016/5/10/chartex" xmlns:cx5="http://schemas.microsoft.com/office/drawing/2016/5/11/chartex" xmlns:cx6="http://schemas.microsoft.com/office/drawing/2016/5/12/chartex" xmlns:cx7="http://schemas.microsoft.com/office/drawing/2016/5/13/chartex" xmlns:cx8="http://schemas.microsoft.com/office/drawing/2016/5/14/chartex" xmlns:cr="http://schemas.microsoft.com/office/comments/2020/reactions" xmlns:mc="http://schemas.openxmlformats.org/markup-compatibility/2006" xmlns:aink="http://schemas.microsoft.com/office/drawing/2016/ink" xmlns:am3d="http://schemas.microsoft.com/office/drawing/2017/model3d" xmlns:o="urn:schemas-microsoft-com:office:office" xmlns:oel="http://schemas.microsoft.com/office/2019/extlst" xmlns:r="http://schemas.openxmlformats.org/officeDocument/2006/relationships" xmlns:m="http://schemas.openxmlformats.org/officeDocument/2006/math" xmlns:v="urn:schemas-microsoft-com:vml" xmlns:wp14="http://schemas.microsoft.com/office/word/2010/wordprocessingDrawing" xmlns:wp="http://schemas.openxmlformats.org/drawingml/2006/wordprocessingDrawing" xmlns:w10="urn:schemas-microsoft-com:office:word" xmlns:w="http://schemas.openxmlformats.org/wordprocessingml/2006/main" xmlns:w14="http://schemas.microsoft.com/office/word/2010/wordml" xmlns:w15="http://schemas.microsoft.com/office/word/2012/wordml" xmlns:w16cex="http://schemas.microsoft.com/office/word/2018/wordml/cex" xmlns:w16cid="http://schemas.microsoft.com/office/word/2016/wordml/cid" xmlns:w16="http://schemas.microsoft.com/office/word/2018/wordml" xmlns:w16du="http://schemas.microsoft.com/office/word/2023/wordml/word16du" xmlns:w16sdtdh="http://schemas.microsoft.com/office/word/2020/wordml/sdtdatahash" xmlns:w16sdtfl="http://schemas.microsoft.com/office/word/2024/wordml/sdtformatlock" xmlns:w16se="http://schemas.microsoft.com/office/word/2015/wordml/symex" xmlns:wpg="http://schemas.microsoft.com/office/word/2010/wordprocessingGroup" xmlns:wpi="http://schemas.microsoft.com/office/word/2010/wordprocessingInk" xmlns:wne="http://schemas.microsoft.com/office/word/2006/wordml" xmlns:wps="http://schemas.microsoft.com/office/word/2010/wordprocessingShape" mc:Ignorable="w14 w15 w16se w16cid w16 w16cex w16sdtdh w16sdtfl cr w16du wp14">
+<w16cex:commentsExtensible xmlns:wpc="http://schemas.microsoft.com/office/word/2010/wordprocessingCanvas" xmlns:cx="http://schemas.microsoft.com/office/drawing/2014/chartex" xmlns:cx1="http://schemas.microsoft.com/office/drawing/2015/9/8/chartex" xmlns:cx2="http://schemas.microsoft.com/office/drawing/2015/10/21/chartex" xmlns:cx3="http://schemas.microsoft.com/office/drawing/2016/5/9/chartex" xmlns:cx4="http://schemas.microsoft.com/office/drawing/2016/5/10/chartex" xmlns:cx5="http://schemas.microsoft.com/office/drawing/2016/5/11/chartex" xmlns:cx6="http://schemas.microsoft.com/office/drawing/2016/5/12/chartex" xmlns:cx7="http://schemas.microsoft.com/office/drawing/2016/5/13/chartex" xmlns:cx8="http://schemas.microsoft.com/office/drawing/2016/5/14/chartex" xmlns:mc="http://schemas.openxmlformats.org/markup-compatibility/2006" xmlns:aink="http://schemas.microsoft.com/office/drawing/2016/ink" xmlns:am3d="http://schemas.microsoft.com/office/drawing/2017/model3d" xmlns:o="urn:schemas-microsoft-com:office:office" xmlns:oel="http://schemas.microsoft.com/office/2019/extlst" xmlns:r="http://schemas.openxmlformats.org/officeDocument/2006/relationships" xmlns:m="http://schemas.openxmlformats.org/officeDocument/2006/math" xmlns:v="urn:schemas-microsoft-com:vml" xmlns:wp14="http://schemas.microsoft.com/office/word/2010/wordprocessingDrawing" xmlns:wp="http://schemas.openxmlformats.org/drawingml/2006/wordprocessingDrawing" xmlns:w10="urn:schemas-microsoft-com:office:word" xmlns:w="http://schemas.openxmlformats.org/wordprocessingml/2006/main" xmlns:w14="http://schemas.microsoft.com/office/word/2010/wordml" xmlns:w15="http://schemas.microsoft.com/office/word/2012/wordml" xmlns:w16cex="http://schemas.microsoft.com/office/word/2018/wordml/cex" xmlns:w16cid="http://schemas.microsoft.com/office/word/2016/wordml/cid" xmlns:w16="http://schemas.microsoft.com/office/word/2018/wordml" xmlns:w16sdtdh="http://schemas.microsoft.com/office/word/2020/wordml/sdtdatahash" xmlns:w16se="http://schemas.microsoft.com/office/word/2015/wordml/symex" xmlns:wpg="http://schemas.microsoft.com/office/word/2010/wordprocessingGroup" xmlns:wpi="http://schemas.microsoft.com/office/word/2010/wordprocessingInk" xmlns:wne="http://schemas.microsoft.com/office/word/2006/wordml" xmlns:wps="http://schemas.microsoft.com/office/word/2010/wordprocessingShape" mc:Ignorable="w14 w15 w16se w16cid w16 w16cex w16sdtdh wp14">
   <w16cex:commentExtensible w16cex:durableId="52C1FBBB" w16cex:dateUtc="2025-12-01T12:49:00Z"/>
 </w16cex:commentsExtensible>
 </file>
 
 <file path=word/commentsIds.xml><?xml version="1.0" encoding="utf-8"?>
-<w16cid:commentsIds xmlns:wpc="http://schemas.microsoft.com/office/word/2010/wordprocessingCanvas" xmlns:cx="http://schemas.microsoft.com/office/drawing/2014/chartex" xmlns:cx1="http://schemas.microsoft.com/office/drawing/2015/9/8/chartex" xmlns:cx2="http://schemas.microsoft.com/office/drawing/2015/10/21/chartex" xmlns:cx3="http://schemas.microsoft.com/office/drawing/2016/5/9/chartex" xmlns:cx4="http://schemas.microsoft.com/office/drawing/2016/5/10/chartex" xmlns:cx5="http://schemas.microsoft.com/office/drawing/2016/5/11/chartex" xmlns:cx6="http://schemas.microsoft.com/office/drawing/2016/5/12/chartex" xmlns:cx7="http://schemas.microsoft.com/office/drawing/2016/5/13/chartex" xmlns:cx8="http://schemas.microsoft.com/office/drawing/2016/5/14/chartex" xmlns:mc="http://schemas.openxmlformats.org/markup-compatibility/2006" xmlns:aink="http://schemas.microsoft.com/office/drawing/2016/ink" xmlns:am3d="http://schemas.microsoft.com/office/drawing/2017/model3d" xmlns:o="urn:schemas-microsoft-com:office:office" xmlns:oel="http://schemas.microsoft.com/office/2019/extlst" xmlns:r="http://schemas.openxmlformats.org/officeDocument/2006/relationships" xmlns:m="http://schemas.openxmlformats.org/officeDocument/2006/math" xmlns:v="urn:schemas-microsoft-com:vml" xmlns:wp14="http://schemas.microsoft.com/office/word/2010/wordprocessingDrawing" xmlns:wp="http://schemas.openxmlformats.org/drawingml/2006/wordprocessingDrawing" xmlns:w10="urn:schemas-microsoft-com:office:word" xmlns:w="http://schemas.openxmlformats.org/wordprocessingml/2006/main" xmlns:w14="http://schemas.microsoft.com/office/word/2010/wordml" xmlns:w15="http://schemas.microsoft.com/office/word/2012/wordml" xmlns:w16cex="http://schemas.microsoft.com/office/word/2018/wordml/cex" xmlns:w16cid="http://schemas.microsoft.com/office/word/2016/wordml/cid" xmlns:w16="http://schemas.microsoft.com/office/word/2018/wordml" xmlns:w16du="http://schemas.microsoft.com/office/word/2023/wordml/word16du" xmlns:w16sdtdh="http://schemas.microsoft.com/office/word/2020/wordml/sdtdatahash" xmlns:w16sdtfl="http://schemas.microsoft.com/office/word/2024/wordml/sdtformatlock" xmlns:w16se="http://schemas.microsoft.com/office/word/2015/wordml/symex" xmlns:wpg="http://schemas.microsoft.com/office/word/2010/wordprocessingGroup" xmlns:wpi="http://schemas.microsoft.com/office/word/2010/wordprocessingInk" xmlns:wne="http://schemas.microsoft.com/office/word/2006/wordml" xmlns:wps="http://schemas.microsoft.com/office/word/2010/wordprocessingShape" mc:Ignorable="w14 w15 w16se w16cid w16 w16cex w16sdtdh w16sdtfl w16du wp14">
+<w16cid:commentsIds xmlns:wpc="http://schemas.microsoft.com/office/word/2010/wordprocessingCanvas" xmlns:cx="http://schemas.microsoft.com/office/drawing/2014/chartex" xmlns:cx1="http://schemas.microsoft.com/office/drawing/2015/9/8/chartex" xmlns:cx2="http://schemas.microsoft.com/office/drawing/2015/10/21/chartex" xmlns:cx3="http://schemas.microsoft.com/office/drawing/2016/5/9/chartex" xmlns:cx4="http://schemas.microsoft.com/office/drawing/2016/5/10/chartex" xmlns:cx5="http://schemas.microsoft.com/office/drawing/2016/5/11/chartex" xmlns:cx6="http://schemas.microsoft.com/office/drawing/2016/5/12/chartex" xmlns:cx7="http://schemas.microsoft.com/office/drawing/2016/5/13/chartex" xmlns:cx8="http://schemas.microsoft.com/office/drawing/2016/5/14/chartex" xmlns:mc="http://schemas.openxmlformats.org/markup-compatibility/2006" xmlns:aink="http://schemas.microsoft.com/office/drawing/2016/ink" xmlns:am3d="http://schemas.microsoft.com/office/drawing/2017/model3d" xmlns:o="urn:schemas-microsoft-com:office:office" xmlns:oel="http://schemas.microsoft.com/office/2019/extlst" xmlns:r="http://schemas.openxmlformats.org/officeDocument/2006/relationships" xmlns:m="http://schemas.openxmlformats.org/officeDocument/2006/math" xmlns:v="urn:schemas-microsoft-com:vml" xmlns:wp14="http://schemas.microsoft.com/office/word/2010/wordprocessingDrawing" xmlns:wp="http://schemas.openxmlformats.org/drawingml/2006/wordprocessingDrawing" xmlns:w10="urn:schemas-microsoft-com:office:word" xmlns:w="http://schemas.openxmlformats.org/wordprocessingml/2006/main" xmlns:w14="http://schemas.microsoft.com/office/word/2010/wordml" xmlns:w15="http://schemas.microsoft.com/office/word/2012/wordml" xmlns:w16cex="http://schemas.microsoft.com/office/word/2018/wordml/cex" xmlns:w16cid="http://schemas.microsoft.com/office/word/2016/wordml/cid" xmlns:w16="http://schemas.microsoft.com/office/word/2018/wordml" xmlns:w16sdtdh="http://schemas.microsoft.com/office/word/2020/wordml/sdtdatahash" xmlns:w16se="http://schemas.microsoft.com/office/word/2015/wordml/symex" xmlns:wpg="http://schemas.microsoft.com/office/word/2010/wordprocessingGroup" xmlns:wpi="http://schemas.microsoft.com/office/word/2010/wordprocessingInk" xmlns:wne="http://schemas.microsoft.com/office/word/2006/wordml" xmlns:wps="http://schemas.microsoft.com/office/word/2010/wordprocessingShape" mc:Ignorable="w14 w15 w16se w16cid w16 w16cex w16sdtdh wp14">
   <w16cid:commentId w16cid:paraId="234C601F" w16cid:durableId="52C1FBBB"/>
 </w16cid:commentsIds>
 </file>
 
 <file path=word/endnotes.xml><?xml version="1.0" encoding="utf-8"?>
-<w:endnotes xmlns:wpc="http://schemas.microsoft.com/office/word/2010/wordprocessingCanvas" xmlns:cx="http://schemas.microsoft.com/office/drawing/2014/chartex" xmlns:cx1="http://schemas.microsoft.com/office/drawing/2015/9/8/chartex" xmlns:cx2="http://schemas.microsoft.com/office/drawing/2015/10/21/chartex" xmlns:cx3="http://schemas.microsoft.com/office/drawing/2016/5/9/chartex" xmlns:cx4="http://schemas.microsoft.com/office/drawing/2016/5/10/chartex" xmlns:cx5="http://schemas.microsoft.com/office/drawing/2016/5/11/chartex" xmlns:cx6="http://schemas.microsoft.com/office/drawing/2016/5/12/chartex" xmlns:cx7="http://schemas.microsoft.com/office/drawing/2016/5/13/chartex" xmlns:cx8="http://schemas.microsoft.com/office/drawing/2016/5/14/chartex" xmlns:mc="http://schemas.openxmlformats.org/markup-compatibility/2006" xmlns:aink="http://schemas.microsoft.com/office/drawing/2016/ink" xmlns:am3d="http://schemas.microsoft.com/office/drawing/2017/model3d" xmlns:o="urn:schemas-microsoft-com:office:office" xmlns:oel="http://schemas.microsoft.com/office/2019/extlst" xmlns:r="http://schemas.openxmlformats.org/officeDocument/2006/relationships" xmlns:m="http://schemas.openxmlformats.org/officeDocument/2006/math" xmlns:v="urn:schemas-microsoft-com:vml" xmlns:wp14="http://schemas.microsoft.com/office/word/2010/wordprocessingDrawing" xmlns:wp="http://schemas.openxmlformats.org/drawingml/2006/wordprocessingDrawing" xmlns:w10="urn:schemas-microsoft-com:office:word" xmlns:w="http://schemas.openxmlformats.org/wordprocessingml/2006/main" xmlns:w14="http://schemas.microsoft.com/office/word/2010/wordml" xmlns:w15="http://schemas.microsoft.com/office/word/2012/wordml" xmlns:w16cex="http://schemas.microsoft.com/office/word/2018/wordml/cex" xmlns:w16cid="http://schemas.microsoft.com/office/word/2016/wordml/cid" xmlns:w16="http://schemas.microsoft.com/office/word/2018/wordml" xmlns:w16du="http://schemas.microsoft.com/office/word/2023/wordml/word16du" xmlns:w16sdtdh="http://schemas.microsoft.com/office/word/2020/wordml/sdtdatahash" xmlns:w16sdtfl="http://schemas.microsoft.com/office/word/2024/wordml/sdtformatlock" xmlns:w16se="http://schemas.microsoft.com/office/word/2015/wordml/symex" xmlns:wpg="http://schemas.microsoft.com/office/word/2010/wordprocessingGroup" xmlns:wpi="http://schemas.microsoft.com/office/word/2010/wordprocessingInk" xmlns:wne="http://schemas.microsoft.com/office/word/2006/wordml" xmlns:wps="http://schemas.microsoft.com/office/word/2010/wordprocessingShape" mc:Ignorable="w14 w15 w16se w16cid w16 w16cex w16sdtdh w16sdtfl w16du wp14">
+<w:endnotes xmlns:wpc="http://schemas.microsoft.com/office/word/2010/wordprocessingCanvas" xmlns:cx="http://schemas.microsoft.com/office/drawing/2014/chartex" xmlns:cx1="http://schemas.microsoft.com/office/drawing/2015/9/8/chartex" xmlns:cx2="http://schemas.microsoft.com/office/drawing/2015/10/21/chartex" xmlns:cx3="http://schemas.microsoft.com/office/drawing/2016/5/9/chartex" xmlns:cx4="http://schemas.microsoft.com/office/drawing/2016/5/10/chartex" xmlns:cx5="http://schemas.microsoft.com/office/drawing/2016/5/11/chartex" xmlns:cx6="http://schemas.microsoft.com/office/drawing/2016/5/12/chartex" xmlns:cx7="http://schemas.microsoft.com/office/drawing/2016/5/13/chartex" xmlns:cx8="http://schemas.microsoft.com/office/drawing/2016/5/14/chartex" xmlns:mc="http://schemas.openxmlformats.org/markup-compatibility/2006" xmlns:aink="http://schemas.microsoft.com/office/drawing/2016/ink" xmlns:am3d="http://schemas.microsoft.com/office/drawing/2017/model3d" xmlns:o="urn:schemas-microsoft-com:office:office" xmlns:oel="http://schemas.microsoft.com/office/2019/extlst" xmlns:r="http://schemas.openxmlformats.org/officeDocument/2006/relationships" xmlns:m="http://schemas.openxmlformats.org/officeDocument/2006/math" xmlns:v="urn:schemas-microsoft-com:vml" xmlns:wp14="http://schemas.microsoft.com/office/word/2010/wordprocessingDrawing" xmlns:wp="http://schemas.openxmlformats.org/drawingml/2006/wordprocessingDrawing" xmlns:w10="urn:schemas-microsoft-com:office:word" xmlns:w="http://schemas.openxmlformats.org/wordprocessingml/2006/main" xmlns:w14="http://schemas.microsoft.com/office/word/2010/wordml" xmlns:w15="http://schemas.microsoft.com/office/word/2012/wordml" xmlns:w16cex="http://schemas.microsoft.com/office/word/2018/wordml/cex" xmlns:w16cid="http://schemas.microsoft.com/office/word/2016/wordml/cid" xmlns:w16="http://schemas.microsoft.com/office/word/2018/wordml" xmlns:w16sdtdh="http://schemas.microsoft.com/office/word/2020/wordml/sdtdatahash" xmlns:w16se="http://schemas.microsoft.com/office/word/2015/wordml/symex" xmlns:wpg="http://schemas.microsoft.com/office/word/2010/wordprocessingGroup" xmlns:wpi="http://schemas.microsoft.com/office/word/2010/wordprocessingInk" xmlns:wne="http://schemas.microsoft.com/office/word/2006/wordml" xmlns:wps="http://schemas.microsoft.com/office/word/2010/wordprocessingShape" mc:Ignorable="w14 w15 w16se w16cid w16 w16cex w16sdtdh wp14">
   <w:endnote w:type="separator" w:id="-1">
     <w:p>
       <w:pPr>
@@ -6773,10 +6835,10 @@
 </file>
 
 <file path=word/footer1.xml><?xml version="1.0" encoding="utf-8"?>
-<w:ftr xmlns:wpc="http://schemas.microsoft.com/office/word/2010/wordprocessingCanvas" xmlns:cx="http://schemas.microsoft.com/office/drawing/2014/chartex" xmlns:cx1="http://schemas.microsoft.com/office/drawing/2015/9/8/chartex" xmlns:cx2="http://schemas.microsoft.com/office/drawing/2015/10/21/chartex" xmlns:cx3="http://schemas.microsoft.com/office/drawing/2016/5/9/chartex" xmlns:cx4="http://schemas.microsoft.com/office/drawing/2016/5/10/chartex" xmlns:cx5="http://schemas.microsoft.com/office/drawing/2016/5/11/chartex" xmlns:cx6="http://schemas.microsoft.com/office/drawing/2016/5/12/chartex" xmlns:cx7="http://schemas.microsoft.com/office/drawing/2016/5/13/chartex" xmlns:cx8="http://schemas.microsoft.com/office/drawing/2016/5/14/chartex" xmlns:mc="http://schemas.openxmlformats.org/markup-compatibility/2006" xmlns:aink="http://schemas.microsoft.com/office/drawing/2016/ink" xmlns:am3d="http://schemas.microsoft.com/office/drawing/2017/model3d" xmlns:o="urn:schemas-microsoft-com:office:office" xmlns:oel="http://schemas.microsoft.com/office/2019/extlst" xmlns:r="http://schemas.openxmlformats.org/officeDocument/2006/relationships" xmlns:m="http://schemas.openxmlformats.org/officeDocument/2006/math" xmlns:v="urn:schemas-microsoft-com:vml" xmlns:wp14="http://schemas.microsoft.com/office/word/2010/wordprocessingDrawing" xmlns:wp="http://schemas.openxmlformats.org/drawingml/2006/wordprocessingDrawing" xmlns:w10="urn:schemas-microsoft-com:office:word" xmlns:w="http://schemas.openxmlformats.org/wordprocessingml/2006/main" xmlns:w14="http://schemas.microsoft.com/office/word/2010/wordml" xmlns:w15="http://schemas.microsoft.com/office/word/2012/wordml" xmlns:w16cex="http://schemas.microsoft.com/office/word/2018/wordml/cex" xmlns:w16cid="http://schemas.microsoft.com/office/word/2016/wordml/cid" xmlns:w16="http://schemas.microsoft.com/office/word/2018/wordml" xmlns:w16du="http://schemas.microsoft.com/office/word/2023/wordml/word16du" xmlns:w16sdtdh="http://schemas.microsoft.com/office/word/2020/wordml/sdtdatahash" xmlns:w16sdtfl="http://schemas.microsoft.com/office/word/2024/wordml/sdtformatlock" xmlns:w16se="http://schemas.microsoft.com/office/word/2015/wordml/symex" xmlns:wpg="http://schemas.microsoft.com/office/word/2010/wordprocessingGroup" xmlns:wpi="http://schemas.microsoft.com/office/word/2010/wordprocessingInk" xmlns:wne="http://schemas.microsoft.com/office/word/2006/wordml" xmlns:wps="http://schemas.microsoft.com/office/word/2010/wordprocessingShape" mc:Ignorable="w14 w15 w16se w16cid w16 w16cex w16sdtdh w16sdtfl w16du wp14">
+<w:ftr xmlns:wpc="http://schemas.microsoft.com/office/word/2010/wordprocessingCanvas" xmlns:cx="http://schemas.microsoft.com/office/drawing/2014/chartex" xmlns:cx1="http://schemas.microsoft.com/office/drawing/2015/9/8/chartex" xmlns:cx2="http://schemas.microsoft.com/office/drawing/2015/10/21/chartex" xmlns:cx3="http://schemas.microsoft.com/office/drawing/2016/5/9/chartex" xmlns:cx4="http://schemas.microsoft.com/office/drawing/2016/5/10/chartex" xmlns:cx5="http://schemas.microsoft.com/office/drawing/2016/5/11/chartex" xmlns:cx6="http://schemas.microsoft.com/office/drawing/2016/5/12/chartex" xmlns:cx7="http://schemas.microsoft.com/office/drawing/2016/5/13/chartex" xmlns:cx8="http://schemas.microsoft.com/office/drawing/2016/5/14/chartex" xmlns:mc="http://schemas.openxmlformats.org/markup-compatibility/2006" xmlns:aink="http://schemas.microsoft.com/office/drawing/2016/ink" xmlns:am3d="http://schemas.microsoft.com/office/drawing/2017/model3d" xmlns:o="urn:schemas-microsoft-com:office:office" xmlns:oel="http://schemas.microsoft.com/office/2019/extlst" xmlns:r="http://schemas.openxmlformats.org/officeDocument/2006/relationships" xmlns:m="http://schemas.openxmlformats.org/officeDocument/2006/math" xmlns:v="urn:schemas-microsoft-com:vml" xmlns:wp14="http://schemas.microsoft.com/office/word/2010/wordprocessingDrawing" xmlns:wp="http://schemas.openxmlformats.org/drawingml/2006/wordprocessingDrawing" xmlns:w10="urn:schemas-microsoft-com:office:word" xmlns:w="http://schemas.openxmlformats.org/wordprocessingml/2006/main" xmlns:w14="http://schemas.microsoft.com/office/word/2010/wordml" xmlns:w15="http://schemas.microsoft.com/office/word/2012/wordml" xmlns:w16cex="http://schemas.microsoft.com/office/word/2018/wordml/cex" xmlns:w16cid="http://schemas.microsoft.com/office/word/2016/wordml/cid" xmlns:w16="http://schemas.microsoft.com/office/word/2018/wordml" xmlns:w16sdtdh="http://schemas.microsoft.com/office/word/2020/wordml/sdtdatahash" xmlns:w16se="http://schemas.microsoft.com/office/word/2015/wordml/symex" xmlns:wpg="http://schemas.microsoft.com/office/word/2010/wordprocessingGroup" xmlns:wpi="http://schemas.microsoft.com/office/word/2010/wordprocessingInk" xmlns:wne="http://schemas.microsoft.com/office/word/2006/wordml" xmlns:wps="http://schemas.microsoft.com/office/word/2010/wordprocessingShape" mc:Ignorable="w14 w15 w16se w16cid w16 w16cex w16sdtdh wp14">
   <w:p>
     <w:pPr>
-      <w:pStyle w:val="Footer"/>
+      <w:pStyle w:val="Piedepgina"/>
       <w:spacing w:before="240"/>
       <w:jc w:val="right"/>
     </w:pPr>
@@ -6840,7 +6902,7 @@
 </file>
 
 <file path=word/footnotes.xml><?xml version="1.0" encoding="utf-8"?>
-<w:footnotes xmlns:wpc="http://schemas.microsoft.com/office/word/2010/wordprocessingCanvas" xmlns:cx="http://schemas.microsoft.com/office/drawing/2014/chartex" xmlns:cx1="http://schemas.microsoft.com/office/drawing/2015/9/8/chartex" xmlns:cx2="http://schemas.microsoft.com/office/drawing/2015/10/21/chartex" xmlns:cx3="http://schemas.microsoft.com/office/drawing/2016/5/9/chartex" xmlns:cx4="http://schemas.microsoft.com/office/drawing/2016/5/10/chartex" xmlns:cx5="http://schemas.microsoft.com/office/drawing/2016/5/11/chartex" xmlns:cx6="http://schemas.microsoft.com/office/drawing/2016/5/12/chartex" xmlns:cx7="http://schemas.microsoft.com/office/drawing/2016/5/13/chartex" xmlns:cx8="http://schemas.microsoft.com/office/drawing/2016/5/14/chartex" xmlns:mc="http://schemas.openxmlformats.org/markup-compatibility/2006" xmlns:aink="http://schemas.microsoft.com/office/drawing/2016/ink" xmlns:am3d="http://schemas.microsoft.com/office/drawing/2017/model3d" xmlns:o="urn:schemas-microsoft-com:office:office" xmlns:oel="http://schemas.microsoft.com/office/2019/extlst" xmlns:r="http://schemas.openxmlformats.org/officeDocument/2006/relationships" xmlns:m="http://schemas.openxmlformats.org/officeDocument/2006/math" xmlns:v="urn:schemas-microsoft-com:vml" xmlns:wp14="http://schemas.microsoft.com/office/word/2010/wordprocessingDrawing" xmlns:wp="http://schemas.openxmlformats.org/drawingml/2006/wordprocessingDrawing" xmlns:w10="urn:schemas-microsoft-com:office:word" xmlns:w="http://schemas.openxmlformats.org/wordprocessingml/2006/main" xmlns:w14="http://schemas.microsoft.com/office/word/2010/wordml" xmlns:w15="http://schemas.microsoft.com/office/word/2012/wordml" xmlns:w16cex="http://schemas.microsoft.com/office/word/2018/wordml/cex" xmlns:w16cid="http://schemas.microsoft.com/office/word/2016/wordml/cid" xmlns:w16="http://schemas.microsoft.com/office/word/2018/wordml" xmlns:w16du="http://schemas.microsoft.com/office/word/2023/wordml/word16du" xmlns:w16sdtdh="http://schemas.microsoft.com/office/word/2020/wordml/sdtdatahash" xmlns:w16sdtfl="http://schemas.microsoft.com/office/word/2024/wordml/sdtformatlock" xmlns:w16se="http://schemas.microsoft.com/office/word/2015/wordml/symex" xmlns:wpg="http://schemas.microsoft.com/office/word/2010/wordprocessingGroup" xmlns:wpi="http://schemas.microsoft.com/office/word/2010/wordprocessingInk" xmlns:wne="http://schemas.microsoft.com/office/word/2006/wordml" xmlns:wps="http://schemas.microsoft.com/office/word/2010/wordprocessingShape" mc:Ignorable="w14 w15 w16se w16cid w16 w16cex w16sdtdh w16sdtfl w16du wp14">
+<w:footnotes xmlns:wpc="http://schemas.microsoft.com/office/word/2010/wordprocessingCanvas" xmlns:cx="http://schemas.microsoft.com/office/drawing/2014/chartex" xmlns:cx1="http://schemas.microsoft.com/office/drawing/2015/9/8/chartex" xmlns:cx2="http://schemas.microsoft.com/office/drawing/2015/10/21/chartex" xmlns:cx3="http://schemas.microsoft.com/office/drawing/2016/5/9/chartex" xmlns:cx4="http://schemas.microsoft.com/office/drawing/2016/5/10/chartex" xmlns:cx5="http://schemas.microsoft.com/office/drawing/2016/5/11/chartex" xmlns:cx6="http://schemas.microsoft.com/office/drawing/2016/5/12/chartex" xmlns:cx7="http://schemas.microsoft.com/office/drawing/2016/5/13/chartex" xmlns:cx8="http://schemas.microsoft.com/office/drawing/2016/5/14/chartex" xmlns:mc="http://schemas.openxmlformats.org/markup-compatibility/2006" xmlns:aink="http://schemas.microsoft.com/office/drawing/2016/ink" xmlns:am3d="http://schemas.microsoft.com/office/drawing/2017/model3d" xmlns:o="urn:schemas-microsoft-com:office:office" xmlns:oel="http://schemas.microsoft.com/office/2019/extlst" xmlns:r="http://schemas.openxmlformats.org/officeDocument/2006/relationships" xmlns:m="http://schemas.openxmlformats.org/officeDocument/2006/math" xmlns:v="urn:schemas-microsoft-com:vml" xmlns:wp14="http://schemas.microsoft.com/office/word/2010/wordprocessingDrawing" xmlns:wp="http://schemas.openxmlformats.org/drawingml/2006/wordprocessingDrawing" xmlns:w10="urn:schemas-microsoft-com:office:word" xmlns:w="http://schemas.openxmlformats.org/wordprocessingml/2006/main" xmlns:w14="http://schemas.microsoft.com/office/word/2010/wordml" xmlns:w15="http://schemas.microsoft.com/office/word/2012/wordml" xmlns:w16cex="http://schemas.microsoft.com/office/word/2018/wordml/cex" xmlns:w16cid="http://schemas.microsoft.com/office/word/2016/wordml/cid" xmlns:w16="http://schemas.microsoft.com/office/word/2018/wordml" xmlns:w16sdtdh="http://schemas.microsoft.com/office/word/2020/wordml/sdtdatahash" xmlns:w16se="http://schemas.microsoft.com/office/word/2015/wordml/symex" xmlns:wpg="http://schemas.microsoft.com/office/word/2010/wordprocessingGroup" xmlns:wpi="http://schemas.microsoft.com/office/word/2010/wordprocessingInk" xmlns:wne="http://schemas.microsoft.com/office/word/2006/wordml" xmlns:wps="http://schemas.microsoft.com/office/word/2010/wordprocessingShape" mc:Ignorable="w14 w15 w16se w16cid w16 w16cex w16sdtdh wp14">
   <w:footnote w:type="separator" w:id="-1">
     <w:p>
       <w:pPr>
@@ -6865,10 +6927,10 @@
 </file>
 
 <file path=word/header1.xml><?xml version="1.0" encoding="utf-8"?>
-<w:hdr xmlns:wpc="http://schemas.microsoft.com/office/word/2010/wordprocessingCanvas" xmlns:cx="http://schemas.microsoft.com/office/drawing/2014/chartex" xmlns:cx1="http://schemas.microsoft.com/office/drawing/2015/9/8/chartex" xmlns:cx2="http://schemas.microsoft.com/office/drawing/2015/10/21/chartex" xmlns:cx3="http://schemas.microsoft.com/office/drawing/2016/5/9/chartex" xmlns:cx4="http://schemas.microsoft.com/office/drawing/2016/5/10/chartex" xmlns:cx5="http://schemas.microsoft.com/office/drawing/2016/5/11/chartex" xmlns:cx6="http://schemas.microsoft.com/office/drawing/2016/5/12/chartex" xmlns:cx7="http://schemas.microsoft.com/office/drawing/2016/5/13/chartex" xmlns:cx8="http://schemas.microsoft.com/office/drawing/2016/5/14/chartex" xmlns:mc="http://schemas.openxmlformats.org/markup-compatibility/2006" xmlns:aink="http://schemas.microsoft.com/office/drawing/2016/ink" xmlns:am3d="http://schemas.microsoft.com/office/drawing/2017/model3d" xmlns:o="urn:schemas-microsoft-com:office:office" xmlns:oel="http://schemas.microsoft.com/office/2019/extlst" xmlns:r="http://schemas.openxmlformats.org/officeDocument/2006/relationships" xmlns:m="http://schemas.openxmlformats.org/officeDocument/2006/math" xmlns:v="urn:schemas-microsoft-com:vml" xmlns:wp14="http://schemas.microsoft.com/office/word/2010/wordprocessingDrawing" xmlns:wp="http://schemas.openxmlformats.org/drawingml/2006/wordprocessingDrawing" xmlns:w10="urn:schemas-microsoft-com:office:word" xmlns:w="http://schemas.openxmlformats.org/wordprocessingml/2006/main" xmlns:w14="http://schemas.microsoft.com/office/word/2010/wordml" xmlns:w15="http://schemas.microsoft.com/office/word/2012/wordml" xmlns:w16cex="http://schemas.microsoft.com/office/word/2018/wordml/cex" xmlns:w16cid="http://schemas.microsoft.com/office/word/2016/wordml/cid" xmlns:w16="http://schemas.microsoft.com/office/word/2018/wordml" xmlns:w16du="http://schemas.microsoft.com/office/word/2023/wordml/word16du" xmlns:w16sdtdh="http://schemas.microsoft.com/office/word/2020/wordml/sdtdatahash" xmlns:w16sdtfl="http://schemas.microsoft.com/office/word/2024/wordml/sdtformatlock" xmlns:w16se="http://schemas.microsoft.com/office/word/2015/wordml/symex" xmlns:wpg="http://schemas.microsoft.com/office/word/2010/wordprocessingGroup" xmlns:wpi="http://schemas.microsoft.com/office/word/2010/wordprocessingInk" xmlns:wne="http://schemas.microsoft.com/office/word/2006/wordml" xmlns:wps="http://schemas.microsoft.com/office/word/2010/wordprocessingShape" mc:Ignorable="w14 w15 w16se w16cid w16 w16cex w16sdtdh w16sdtfl w16du wp14">
+<w:hdr xmlns:wpc="http://schemas.microsoft.com/office/word/2010/wordprocessingCanvas" xmlns:cx="http://schemas.microsoft.com/office/drawing/2014/chartex" xmlns:cx1="http://schemas.microsoft.com/office/drawing/2015/9/8/chartex" xmlns:cx2="http://schemas.microsoft.com/office/drawing/2015/10/21/chartex" xmlns:cx3="http://schemas.microsoft.com/office/drawing/2016/5/9/chartex" xmlns:cx4="http://schemas.microsoft.com/office/drawing/2016/5/10/chartex" xmlns:cx5="http://schemas.microsoft.com/office/drawing/2016/5/11/chartex" xmlns:cx6="http://schemas.microsoft.com/office/drawing/2016/5/12/chartex" xmlns:cx7="http://schemas.microsoft.com/office/drawing/2016/5/13/chartex" xmlns:cx8="http://schemas.microsoft.com/office/drawing/2016/5/14/chartex" xmlns:mc="http://schemas.openxmlformats.org/markup-compatibility/2006" xmlns:aink="http://schemas.microsoft.com/office/drawing/2016/ink" xmlns:am3d="http://schemas.microsoft.com/office/drawing/2017/model3d" xmlns:o="urn:schemas-microsoft-com:office:office" xmlns:oel="http://schemas.microsoft.com/office/2019/extlst" xmlns:r="http://schemas.openxmlformats.org/officeDocument/2006/relationships" xmlns:m="http://schemas.openxmlformats.org/officeDocument/2006/math" xmlns:v="urn:schemas-microsoft-com:vml" xmlns:wp14="http://schemas.microsoft.com/office/word/2010/wordprocessingDrawing" xmlns:wp="http://schemas.openxmlformats.org/drawingml/2006/wordprocessingDrawing" xmlns:w10="urn:schemas-microsoft-com:office:word" xmlns:w="http://schemas.openxmlformats.org/wordprocessingml/2006/main" xmlns:w14="http://schemas.microsoft.com/office/word/2010/wordml" xmlns:w15="http://schemas.microsoft.com/office/word/2012/wordml" xmlns:w16cex="http://schemas.microsoft.com/office/word/2018/wordml/cex" xmlns:w16cid="http://schemas.microsoft.com/office/word/2016/wordml/cid" xmlns:w16="http://schemas.microsoft.com/office/word/2018/wordml" xmlns:w16sdtdh="http://schemas.microsoft.com/office/word/2020/wordml/sdtdatahash" xmlns:w16se="http://schemas.microsoft.com/office/word/2015/wordml/symex" xmlns:wpg="http://schemas.microsoft.com/office/word/2010/wordprocessingGroup" xmlns:wpi="http://schemas.microsoft.com/office/word/2010/wordprocessingInk" xmlns:wne="http://schemas.microsoft.com/office/word/2006/wordml" xmlns:wps="http://schemas.microsoft.com/office/word/2010/wordprocessingShape" mc:Ignorable="w14 w15 w16se w16cid w16 w16cex w16sdtdh wp14">
   <w:p>
     <w:pPr>
-      <w:pStyle w:val="Header"/>
+      <w:pStyle w:val="Encabezado"/>
       <w:spacing w:after="240"/>
       <w:jc w:val="right"/>
     </w:pPr>
@@ -6931,7 +6993,7 @@
 </file>
 
 <file path=word/numbering.xml><?xml version="1.0" encoding="utf-8"?>
-<w:numbering xmlns:wpc="http://schemas.microsoft.com/office/word/2010/wordprocessingCanvas" xmlns:cx="http://schemas.microsoft.com/office/drawing/2014/chartex" xmlns:cx1="http://schemas.microsoft.com/office/drawing/2015/9/8/chartex" xmlns:cx2="http://schemas.microsoft.com/office/drawing/2015/10/21/chartex" xmlns:cx3="http://schemas.microsoft.com/office/drawing/2016/5/9/chartex" xmlns:cx4="http://schemas.microsoft.com/office/drawing/2016/5/10/chartex" xmlns:cx5="http://schemas.microsoft.com/office/drawing/2016/5/11/chartex" xmlns:cx6="http://schemas.microsoft.com/office/drawing/2016/5/12/chartex" xmlns:cx7="http://schemas.microsoft.com/office/drawing/2016/5/13/chartex" xmlns:cx8="http://schemas.microsoft.com/office/drawing/2016/5/14/chartex" xmlns:mc="http://schemas.openxmlformats.org/markup-compatibility/2006" xmlns:aink="http://schemas.microsoft.com/office/drawing/2016/ink" xmlns:am3d="http://schemas.microsoft.com/office/drawing/2017/model3d" xmlns:o="urn:schemas-microsoft-com:office:office" xmlns:oel="http://schemas.microsoft.com/office/2019/extlst" xmlns:r="http://schemas.openxmlformats.org/officeDocument/2006/relationships" xmlns:m="http://schemas.openxmlformats.org/officeDocument/2006/math" xmlns:v="urn:schemas-microsoft-com:vml" xmlns:wp14="http://schemas.microsoft.com/office/word/2010/wordprocessingDrawing" xmlns:wp="http://schemas.openxmlformats.org/drawingml/2006/wordprocessingDrawing" xmlns:w10="urn:schemas-microsoft-com:office:word" xmlns:w="http://schemas.openxmlformats.org/wordprocessingml/2006/main" xmlns:w14="http://schemas.microsoft.com/office/word/2010/wordml" xmlns:w15="http://schemas.microsoft.com/office/word/2012/wordml" xmlns:w16cex="http://schemas.microsoft.com/office/word/2018/wordml/cex" xmlns:w16cid="http://schemas.microsoft.com/office/word/2016/wordml/cid" xmlns:w16="http://schemas.microsoft.com/office/word/2018/wordml" xmlns:w16du="http://schemas.microsoft.com/office/word/2023/wordml/word16du" xmlns:w16sdtdh="http://schemas.microsoft.com/office/word/2020/wordml/sdtdatahash" xmlns:w16sdtfl="http://schemas.microsoft.com/office/word/2024/wordml/sdtformatlock" xmlns:w16se="http://schemas.microsoft.com/office/word/2015/wordml/symex" xmlns:wpg="http://schemas.microsoft.com/office/word/2010/wordprocessingGroup" xmlns:wpi="http://schemas.microsoft.com/office/word/2010/wordprocessingInk" xmlns:wne="http://schemas.microsoft.com/office/word/2006/wordml" xmlns:wps="http://schemas.microsoft.com/office/word/2010/wordprocessingShape" mc:Ignorable="w14 w15 w16se w16cid w16 w16cex w16sdtdh w16sdtfl w16du wp14">
+<w:numbering xmlns:wpc="http://schemas.microsoft.com/office/word/2010/wordprocessingCanvas" xmlns:cx="http://schemas.microsoft.com/office/drawing/2014/chartex" xmlns:cx1="http://schemas.microsoft.com/office/drawing/2015/9/8/chartex" xmlns:cx2="http://schemas.microsoft.com/office/drawing/2015/10/21/chartex" xmlns:cx3="http://schemas.microsoft.com/office/drawing/2016/5/9/chartex" xmlns:cx4="http://schemas.microsoft.com/office/drawing/2016/5/10/chartex" xmlns:cx5="http://schemas.microsoft.com/office/drawing/2016/5/11/chartex" xmlns:cx6="http://schemas.microsoft.com/office/drawing/2016/5/12/chartex" xmlns:cx7="http://schemas.microsoft.com/office/drawing/2016/5/13/chartex" xmlns:cx8="http://schemas.microsoft.com/office/drawing/2016/5/14/chartex" xmlns:mc="http://schemas.openxmlformats.org/markup-compatibility/2006" xmlns:aink="http://schemas.microsoft.com/office/drawing/2016/ink" xmlns:am3d="http://schemas.microsoft.com/office/drawing/2017/model3d" xmlns:o="urn:schemas-microsoft-com:office:office" xmlns:oel="http://schemas.microsoft.com/office/2019/extlst" xmlns:r="http://schemas.openxmlformats.org/officeDocument/2006/relationships" xmlns:m="http://schemas.openxmlformats.org/officeDocument/2006/math" xmlns:v="urn:schemas-microsoft-com:vml" xmlns:wp14="http://schemas.microsoft.com/office/word/2010/wordprocessingDrawing" xmlns:wp="http://schemas.openxmlformats.org/drawingml/2006/wordprocessingDrawing" xmlns:w10="urn:schemas-microsoft-com:office:word" xmlns:w="http://schemas.openxmlformats.org/wordprocessingml/2006/main" xmlns:w14="http://schemas.microsoft.com/office/word/2010/wordml" xmlns:w15="http://schemas.microsoft.com/office/word/2012/wordml" xmlns:w16cex="http://schemas.microsoft.com/office/word/2018/wordml/cex" xmlns:w16cid="http://schemas.microsoft.com/office/word/2016/wordml/cid" xmlns:w16="http://schemas.microsoft.com/office/word/2018/wordml" xmlns:w16sdtdh="http://schemas.microsoft.com/office/word/2020/wordml/sdtdatahash" xmlns:w16se="http://schemas.microsoft.com/office/word/2015/wordml/symex" xmlns:wpg="http://schemas.microsoft.com/office/word/2010/wordprocessingGroup" xmlns:wpi="http://schemas.microsoft.com/office/word/2010/wordprocessingInk" xmlns:wne="http://schemas.microsoft.com/office/word/2006/wordml" xmlns:wps="http://schemas.microsoft.com/office/word/2010/wordprocessingShape" mc:Ignorable="w14 w15 w16se w16cid w16 w16cex w16sdtdh wp14">
   <w:abstractNum w:abstractNumId="0" w15:restartNumberingAfterBreak="0">
     <w:nsid w:val="11424236"/>
     <w:multiLevelType w:val="multilevel"/>
@@ -7964,7 +8026,7 @@
     <w:lvl w:ilvl="0">
       <w:start w:val="1"/>
       <w:numFmt w:val="upperRoman"/>
-      <w:pStyle w:val="Heading1"/>
+      <w:pStyle w:val="Ttulo1"/>
       <w:suff w:val="nothing"/>
       <w:lvlText w:val="Artículo %1"/>
       <w:lvlJc w:val="left"/>
@@ -7997,7 +8059,7 @@
     <w:lvl w:ilvl="1">
       <w:start w:val="1"/>
       <w:numFmt w:val="decimalZero"/>
-      <w:pStyle w:val="Heading2"/>
+      <w:pStyle w:val="Ttulo2"/>
       <w:isLgl/>
       <w:lvlText w:val="Sección %1.%2"/>
       <w:lvlJc w:val="left"/>
@@ -8030,7 +8092,7 @@
     <w:lvl w:ilvl="2">
       <w:start w:val="1"/>
       <w:numFmt w:val="lowerLetter"/>
-      <w:pStyle w:val="Heading3"/>
+      <w:pStyle w:val="Ttulo3"/>
       <w:lvlText w:val="(%3)"/>
       <w:lvlJc w:val="left"/>
       <w:pPr>
@@ -8067,7 +8129,7 @@
     <w:lvl w:ilvl="3">
       <w:start w:val="1"/>
       <w:numFmt w:val="lowerRoman"/>
-      <w:pStyle w:val="Heading4"/>
+      <w:pStyle w:val="Ttulo4"/>
       <w:lvlText w:val="(%4)"/>
       <w:lvlJc w:val="left"/>
       <w:pPr>
@@ -8097,7 +8159,7 @@
     <w:lvl w:ilvl="4">
       <w:start w:val="1"/>
       <w:numFmt w:val="decimal"/>
-      <w:pStyle w:val="Heading5"/>
+      <w:pStyle w:val="Ttulo5"/>
       <w:lvlText w:val="(%5)"/>
       <w:lvlJc w:val="left"/>
       <w:pPr>
@@ -8127,7 +8189,7 @@
     <w:lvl w:ilvl="5">
       <w:start w:val="1"/>
       <w:numFmt w:val="upperLetter"/>
-      <w:pStyle w:val="Heading6"/>
+      <w:pStyle w:val="Ttulo6"/>
       <w:suff w:val="nothing"/>
       <w:lvlText w:val="Anexo %6"/>
       <w:lvlJc w:val="left"/>
@@ -8785,7 +8847,7 @@
 </file>
 
 <file path=word/people.xml><?xml version="1.0" encoding="utf-8"?>
-<w15:people xmlns:wpc="http://schemas.microsoft.com/office/word/2010/wordprocessingCanvas" xmlns:cx="http://schemas.microsoft.com/office/drawing/2014/chartex" xmlns:cx1="http://schemas.microsoft.com/office/drawing/2015/9/8/chartex" xmlns:cx2="http://schemas.microsoft.com/office/drawing/2015/10/21/chartex" xmlns:cx3="http://schemas.microsoft.com/office/drawing/2016/5/9/chartex" xmlns:cx4="http://schemas.microsoft.com/office/drawing/2016/5/10/chartex" xmlns:cx5="http://schemas.microsoft.com/office/drawing/2016/5/11/chartex" xmlns:cx6="http://schemas.microsoft.com/office/drawing/2016/5/12/chartex" xmlns:cx7="http://schemas.microsoft.com/office/drawing/2016/5/13/chartex" xmlns:cx8="http://schemas.microsoft.com/office/drawing/2016/5/14/chartex" xmlns:mc="http://schemas.openxmlformats.org/markup-compatibility/2006" xmlns:aink="http://schemas.microsoft.com/office/drawing/2016/ink" xmlns:am3d="http://schemas.microsoft.com/office/drawing/2017/model3d" xmlns:o="urn:schemas-microsoft-com:office:office" xmlns:oel="http://schemas.microsoft.com/office/2019/extlst" xmlns:r="http://schemas.openxmlformats.org/officeDocument/2006/relationships" xmlns:m="http://schemas.openxmlformats.org/officeDocument/2006/math" xmlns:v="urn:schemas-microsoft-com:vml" xmlns:wp14="http://schemas.microsoft.com/office/word/2010/wordprocessingDrawing" xmlns:wp="http://schemas.openxmlformats.org/drawingml/2006/wordprocessingDrawing" xmlns:w10="urn:schemas-microsoft-com:office:word" xmlns:w="http://schemas.openxmlformats.org/wordprocessingml/2006/main" xmlns:w14="http://schemas.microsoft.com/office/word/2010/wordml" xmlns:w15="http://schemas.microsoft.com/office/word/2012/wordml" xmlns:w16cex="http://schemas.microsoft.com/office/word/2018/wordml/cex" xmlns:w16cid="http://schemas.microsoft.com/office/word/2016/wordml/cid" xmlns:w16="http://schemas.microsoft.com/office/word/2018/wordml" xmlns:w16du="http://schemas.microsoft.com/office/word/2023/wordml/word16du" xmlns:w16sdtdh="http://schemas.microsoft.com/office/word/2020/wordml/sdtdatahash" xmlns:w16sdtfl="http://schemas.microsoft.com/office/word/2024/wordml/sdtformatlock" xmlns:w16se="http://schemas.microsoft.com/office/word/2015/wordml/symex" xmlns:wpg="http://schemas.microsoft.com/office/word/2010/wordprocessingGroup" xmlns:wpi="http://schemas.microsoft.com/office/word/2010/wordprocessingInk" xmlns:wne="http://schemas.microsoft.com/office/word/2006/wordml" xmlns:wps="http://schemas.microsoft.com/office/word/2010/wordprocessingShape" mc:Ignorable="w14 w15 w16se w16cid w16 w16cex w16sdtdh w16sdtfl w16du wp14">
+<w15:people xmlns:wpc="http://schemas.microsoft.com/office/word/2010/wordprocessingCanvas" xmlns:cx="http://schemas.microsoft.com/office/drawing/2014/chartex" xmlns:cx1="http://schemas.microsoft.com/office/drawing/2015/9/8/chartex" xmlns:cx2="http://schemas.microsoft.com/office/drawing/2015/10/21/chartex" xmlns:cx3="http://schemas.microsoft.com/office/drawing/2016/5/9/chartex" xmlns:cx4="http://schemas.microsoft.com/office/drawing/2016/5/10/chartex" xmlns:cx5="http://schemas.microsoft.com/office/drawing/2016/5/11/chartex" xmlns:cx6="http://schemas.microsoft.com/office/drawing/2016/5/12/chartex" xmlns:cx7="http://schemas.microsoft.com/office/drawing/2016/5/13/chartex" xmlns:cx8="http://schemas.microsoft.com/office/drawing/2016/5/14/chartex" xmlns:mc="http://schemas.openxmlformats.org/markup-compatibility/2006" xmlns:aink="http://schemas.microsoft.com/office/drawing/2016/ink" xmlns:am3d="http://schemas.microsoft.com/office/drawing/2017/model3d" xmlns:o="urn:schemas-microsoft-com:office:office" xmlns:oel="http://schemas.microsoft.com/office/2019/extlst" xmlns:r="http://schemas.openxmlformats.org/officeDocument/2006/relationships" xmlns:m="http://schemas.openxmlformats.org/officeDocument/2006/math" xmlns:v="urn:schemas-microsoft-com:vml" xmlns:wp14="http://schemas.microsoft.com/office/word/2010/wordprocessingDrawing" xmlns:wp="http://schemas.openxmlformats.org/drawingml/2006/wordprocessingDrawing" xmlns:w10="urn:schemas-microsoft-com:office:word" xmlns:w="http://schemas.openxmlformats.org/wordprocessingml/2006/main" xmlns:w14="http://schemas.microsoft.com/office/word/2010/wordml" xmlns:w15="http://schemas.microsoft.com/office/word/2012/wordml" xmlns:w16cex="http://schemas.microsoft.com/office/word/2018/wordml/cex" xmlns:w16cid="http://schemas.microsoft.com/office/word/2016/wordml/cid" xmlns:w16="http://schemas.microsoft.com/office/word/2018/wordml" xmlns:w16sdtdh="http://schemas.microsoft.com/office/word/2020/wordml/sdtdatahash" xmlns:w16se="http://schemas.microsoft.com/office/word/2015/wordml/symex" xmlns:wpg="http://schemas.microsoft.com/office/word/2010/wordprocessingGroup" xmlns:wpi="http://schemas.microsoft.com/office/word/2010/wordprocessingInk" xmlns:wne="http://schemas.microsoft.com/office/word/2006/wordml" xmlns:wps="http://schemas.microsoft.com/office/word/2010/wordprocessingShape" mc:Ignorable="w14 w15 w16se w16cid w16 w16cex w16sdtdh wp14">
   <w15:person w15:author="Sofia Tobon -FK">
     <w15:presenceInfo w15:providerId="None" w15:userId="Sofia Tobon -FK"/>
   </w15:person>
@@ -8793,7 +8855,7 @@
 </file>
 
 <file path=word/styles.xml><?xml version="1.0" encoding="utf-8"?>
-<w:styles xmlns:mc="http://schemas.openxmlformats.org/markup-compatibility/2006" xmlns:r="http://schemas.openxmlformats.org/officeDocument/2006/relationships" xmlns:w="http://schemas.openxmlformats.org/wordprocessingml/2006/main" xmlns:w14="http://schemas.microsoft.com/office/word/2010/wordml" xmlns:w15="http://schemas.microsoft.com/office/word/2012/wordml" xmlns:w16cex="http://schemas.microsoft.com/office/word/2018/wordml/cex" xmlns:w16cid="http://schemas.microsoft.com/office/word/2016/wordml/cid" xmlns:w16="http://schemas.microsoft.com/office/word/2018/wordml" xmlns:w16du="http://schemas.microsoft.com/office/word/2023/wordml/word16du" xmlns:w16sdtdh="http://schemas.microsoft.com/office/word/2020/wordml/sdtdatahash" xmlns:w16sdtfl="http://schemas.microsoft.com/office/word/2024/wordml/sdtformatlock" xmlns:w16se="http://schemas.microsoft.com/office/word/2015/wordml/symex" mc:Ignorable="w14 w15 w16se w16cid w16 w16cex w16sdtdh w16sdtfl w16du">
+<w:styles xmlns:mc="http://schemas.openxmlformats.org/markup-compatibility/2006" xmlns:r="http://schemas.openxmlformats.org/officeDocument/2006/relationships" xmlns:w="http://schemas.openxmlformats.org/wordprocessingml/2006/main" xmlns:w14="http://schemas.microsoft.com/office/word/2010/wordml" xmlns:w15="http://schemas.microsoft.com/office/word/2012/wordml" xmlns:w16cex="http://schemas.microsoft.com/office/word/2018/wordml/cex" xmlns:w16cid="http://schemas.microsoft.com/office/word/2016/wordml/cid" xmlns:w16="http://schemas.microsoft.com/office/word/2018/wordml" xmlns:w16sdtdh="http://schemas.microsoft.com/office/word/2020/wordml/sdtdatahash" xmlns:w16se="http://schemas.microsoft.com/office/word/2015/wordml/symex" mc:Ignorable="w14 w15 w16se w16cid w16 w16cex w16sdtdh">
   <w:docDefaults>
     <w:rPrDefault>
       <w:rPr>
@@ -9203,12 +9265,12 @@
       <w:lang w:val="es-CO" w:eastAsia="es-CO"/>
     </w:rPr>
   </w:style>
-  <w:style w:type="paragraph" w:styleId="Heading1">
+  <w:style w:type="paragraph" w:styleId="Ttulo1">
     <w:name w:val="heading 1"/>
     <w:aliases w:val="H1,H1-Heading 1,Header 1,Heading 0,Hoofdstukkop,Legal Line 1,Lev 1,MT1,Niveau 1,SECTION,Section,Section Heading,Titulo 1,Título 1 Car,h1,head 1,l1,level 1,level1,título 1,título 11,título 111,título 112,título 12,título 13,título 14,título 15"/>
     <w:basedOn w:val="Normal"/>
     <w:next w:val="Normal"/>
-    <w:link w:val="Heading1Char"/>
+    <w:link w:val="Ttulo1Car1"/>
     <w:uiPriority w:val="9"/>
     <w:qFormat/>
     <w:rsid w:val="00DB0FBF"/>
@@ -9226,12 +9288,12 @@
       <w:u w:val="single"/>
     </w:rPr>
   </w:style>
-  <w:style w:type="paragraph" w:styleId="Heading2">
+  <w:style w:type="paragraph" w:styleId="Ttulo2">
     <w:name w:val="heading 2"/>
     <w:aliases w:val="H2 Char,Subsección,Título 2 Car Car,Título 2 Car Car Car Car,Título 2 Car1,Título 2 Car1 Car Car,SECCIONES,BONUS-T2"/>
     <w:basedOn w:val="Normal"/>
     <w:next w:val="Normal"/>
-    <w:link w:val="Heading2Char"/>
+    <w:link w:val="Ttulo2Car"/>
     <w:uiPriority w:val="9"/>
     <w:unhideWhenUsed/>
     <w:qFormat/>
@@ -9249,12 +9311,12 @@
       <w:u w:val="single"/>
     </w:rPr>
   </w:style>
-  <w:style w:type="paragraph" w:styleId="Heading3">
+  <w:style w:type="paragraph" w:styleId="Ttulo3">
     <w:name w:val="heading 3"/>
     <w:aliases w:val="Style 46,BONUS-T3 Final,Edgar 3,1.1.1Título 3,Título 3-BCN,3 bullet,2,H3,1,1Título 3"/>
     <w:basedOn w:val="Normal"/>
     <w:next w:val="Normal"/>
-    <w:link w:val="Heading3Char"/>
+    <w:link w:val="Ttulo3Car"/>
     <w:unhideWhenUsed/>
     <w:qFormat/>
     <w:rsid w:val="000B498A"/>
@@ -9270,11 +9332,11 @@
       <w:szCs w:val="22"/>
     </w:rPr>
   </w:style>
-  <w:style w:type="paragraph" w:styleId="Heading4">
+  <w:style w:type="paragraph" w:styleId="Ttulo4">
     <w:name w:val="heading 4"/>
     <w:basedOn w:val="Normal"/>
     <w:next w:val="Normal"/>
-    <w:link w:val="Heading4Char"/>
+    <w:link w:val="Ttulo4Car"/>
     <w:unhideWhenUsed/>
     <w:qFormat/>
     <w:rsid w:val="000B498A"/>
@@ -9290,11 +9352,11 @@
       <w:iCs/>
     </w:rPr>
   </w:style>
-  <w:style w:type="paragraph" w:styleId="Heading5">
+  <w:style w:type="paragraph" w:styleId="Ttulo5">
     <w:name w:val="heading 5"/>
     <w:basedOn w:val="Normal"/>
     <w:next w:val="Normal"/>
-    <w:link w:val="Heading5Char"/>
+    <w:link w:val="Ttulo5Car"/>
     <w:unhideWhenUsed/>
     <w:qFormat/>
     <w:rsid w:val="000B498A"/>
@@ -9309,7 +9371,7 @@
       <w:rFonts w:eastAsiaTheme="majorEastAsia" w:cstheme="majorBidi"/>
     </w:rPr>
   </w:style>
-  <w:style w:type="paragraph" w:styleId="Heading6">
+  <w:style w:type="paragraph" w:styleId="Ttulo6">
     <w:name w:val="heading 6"/>
     <w:basedOn w:val="Normal"/>
     <w:next w:val="Normal"/>
@@ -9334,13 +9396,13 @@
       <w:szCs w:val="22"/>
     </w:rPr>
   </w:style>
-  <w:style w:type="character" w:default="1" w:styleId="DefaultParagraphFont">
+  <w:style w:type="character" w:default="1" w:styleId="Fuentedeprrafopredeter">
     <w:name w:val="Default Paragraph Font"/>
     <w:uiPriority w:val="1"/>
     <w:semiHidden/>
     <w:unhideWhenUsed/>
   </w:style>
-  <w:style w:type="table" w:default="1" w:styleId="TableNormal">
+  <w:style w:type="table" w:default="1" w:styleId="Tablanormal">
     <w:name w:val="Normal Table"/>
     <w:uiPriority w:val="99"/>
     <w:semiHidden/>
@@ -9355,7 +9417,7 @@
       </w:tblCellMar>
     </w:tblPr>
   </w:style>
-  <w:style w:type="numbering" w:default="1" w:styleId="NoList">
+  <w:style w:type="numbering" w:default="1" w:styleId="Sinlista">
     <w:name w:val="No List"/>
     <w:uiPriority w:val="99"/>
     <w:semiHidden/>
@@ -9372,7 +9434,7 @@
       </w:tblCellMar>
     </w:tblPr>
   </w:style>
-  <w:style w:type="paragraph" w:styleId="Title">
+  <w:style w:type="paragraph" w:styleId="Ttulo">
     <w:name w:val="Title"/>
     <w:basedOn w:val="Normal"/>
     <w:next w:val="Normal"/>
@@ -9388,7 +9450,7 @@
       <w:szCs w:val="52"/>
     </w:rPr>
   </w:style>
-  <w:style w:type="paragraph" w:styleId="Subtitle">
+  <w:style w:type="paragraph" w:styleId="Subttulo">
     <w:name w:val="Subtitle"/>
     <w:basedOn w:val="Normal"/>
     <w:next w:val="Normal"/>
@@ -9406,26 +9468,26 @@
       <w:szCs w:val="30"/>
     </w:rPr>
   </w:style>
-  <w:style w:type="paragraph" w:styleId="CommentText">
+  <w:style w:type="paragraph" w:styleId="Textocomentario">
     <w:name w:val="annotation text"/>
     <w:basedOn w:val="Normal"/>
-    <w:link w:val="CommentTextChar"/>
+    <w:link w:val="TextocomentarioCar"/>
     <w:uiPriority w:val="99"/>
     <w:unhideWhenUsed/>
   </w:style>
-  <w:style w:type="character" w:customStyle="1" w:styleId="CommentTextChar">
-    <w:name w:val="Comment Text Char"/>
-    <w:basedOn w:val="DefaultParagraphFont"/>
-    <w:link w:val="CommentText"/>
+  <w:style w:type="character" w:customStyle="1" w:styleId="TextocomentarioCar">
+    <w:name w:val="Texto comentario Car"/>
+    <w:basedOn w:val="Fuentedeprrafopredeter"/>
+    <w:link w:val="Textocomentario"/>
     <w:uiPriority w:val="99"/>
     <w:rPr>
       <w:sz w:val="20"/>
       <w:szCs w:val="20"/>
     </w:rPr>
   </w:style>
-  <w:style w:type="character" w:styleId="CommentReference">
+  <w:style w:type="character" w:styleId="Refdecomentario">
     <w:name w:val="annotation reference"/>
-    <w:basedOn w:val="DefaultParagraphFont"/>
+    <w:basedOn w:val="Fuentedeprrafopredeter"/>
     <w:uiPriority w:val="99"/>
     <w:semiHidden/>
     <w:unhideWhenUsed/>
@@ -9496,7 +9558,7 @@
   </w:style>
   <w:style w:type="character" w:customStyle="1" w:styleId="AmArticle3Char">
     <w:name w:val="Am_Article 3 Char"/>
-    <w:basedOn w:val="DefaultParagraphFont"/>
+    <w:basedOn w:val="Fuentedeprrafopredeter"/>
     <w:link w:val="AmArticle3"/>
     <w:rsid w:val="00662BF7"/>
     <w:rPr>
@@ -9508,7 +9570,7 @@
   </w:style>
   <w:style w:type="character" w:customStyle="1" w:styleId="AmArticle3Car">
     <w:name w:val="Am_Article 3 Car"/>
-    <w:basedOn w:val="DefaultParagraphFont"/>
+    <w:basedOn w:val="Fuentedeprrafopredeter"/>
     <w:rsid w:val="00662BF7"/>
     <w:rPr>
       <w:rFonts w:ascii="Open Sans" w:eastAsia="Times New Roman" w:hAnsi="Open Sans" w:cs="Times New Roman"/>
@@ -9538,7 +9600,7 @@
   </w:style>
   <w:style w:type="character" w:customStyle="1" w:styleId="AmArticle4Char">
     <w:name w:val="Am_Article 4 Char"/>
-    <w:basedOn w:val="DefaultParagraphFont"/>
+    <w:basedOn w:val="Fuentedeprrafopredeter"/>
     <w:link w:val="AmArticle4"/>
     <w:rsid w:val="00662BF7"/>
     <w:rPr>
@@ -9569,7 +9631,7 @@
   </w:style>
   <w:style w:type="character" w:customStyle="1" w:styleId="AmArticle5Char">
     <w:name w:val="Am_Article 5 Char"/>
-    <w:basedOn w:val="DefaultParagraphFont"/>
+    <w:basedOn w:val="Fuentedeprrafopredeter"/>
     <w:link w:val="AmArticle5"/>
     <w:rsid w:val="00662BF7"/>
     <w:rPr>
@@ -9598,9 +9660,9 @@
       <w:lang w:val="es-CL" w:eastAsia="zh-CN" w:bidi="he-IL"/>
     </w:rPr>
   </w:style>
-  <w:style w:type="table" w:styleId="TableGrid">
+  <w:style w:type="table" w:styleId="Tablaconcuadrcula">
     <w:name w:val="Table Grid"/>
-    <w:basedOn w:val="TableNormal"/>
+    <w:basedOn w:val="Tablanormal"/>
     <w:uiPriority w:val="39"/>
     <w:rsid w:val="00D96667"/>
     <w:pPr>
@@ -9623,9 +9685,9 @@
       </w:tblBorders>
     </w:tblPr>
   </w:style>
-  <w:style w:type="character" w:styleId="PlaceholderText">
+  <w:style w:type="character" w:styleId="Textodelmarcadordeposicin">
     <w:name w:val="Placeholder Text"/>
-    <w:basedOn w:val="DefaultParagraphFont"/>
+    <w:basedOn w:val="Fuentedeprrafopredeter"/>
     <w:uiPriority w:val="99"/>
     <w:semiHidden/>
     <w:rsid w:val="00D96667"/>
@@ -9633,11 +9695,11 @@
       <w:color w:val="666666"/>
     </w:rPr>
   </w:style>
-  <w:style w:type="paragraph" w:styleId="CommentSubject">
+  <w:style w:type="paragraph" w:styleId="Asuntodelcomentario">
     <w:name w:val="annotation subject"/>
-    <w:basedOn w:val="CommentText"/>
-    <w:next w:val="CommentText"/>
-    <w:link w:val="CommentSubjectChar"/>
+    <w:basedOn w:val="Textocomentario"/>
+    <w:next w:val="Textocomentario"/>
+    <w:link w:val="AsuntodelcomentarioCar"/>
     <w:uiPriority w:val="99"/>
     <w:semiHidden/>
     <w:unhideWhenUsed/>
@@ -9647,10 +9709,10 @@
       <w:bCs/>
     </w:rPr>
   </w:style>
-  <w:style w:type="character" w:customStyle="1" w:styleId="CommentSubjectChar">
-    <w:name w:val="Comment Subject Char"/>
-    <w:basedOn w:val="CommentTextChar"/>
-    <w:link w:val="CommentSubject"/>
+  <w:style w:type="character" w:customStyle="1" w:styleId="AsuntodelcomentarioCar">
+    <w:name w:val="Asunto del comentario Car"/>
+    <w:basedOn w:val="TextocomentarioCar"/>
+    <w:link w:val="Asuntodelcomentario"/>
     <w:uiPriority w:val="99"/>
     <w:semiHidden/>
     <w:rsid w:val="00DA058D"/>
@@ -9663,11 +9725,11 @@
       <w:lang w:val="es-MX" w:eastAsia="en-US"/>
     </w:rPr>
   </w:style>
-  <w:style w:type="paragraph" w:styleId="ListParagraph">
+  <w:style w:type="paragraph" w:styleId="Prrafodelista">
     <w:name w:val="List Paragraph"/>
     <w:aliases w:val="Título1,Colorful List - Accent 11,Bolita,Párrafo antic,BOLADEF,Párrafo de lista2,Párrafo de lista3,Párrafo de lista21,BOLA,1. Anexo,Colorful List Accent 1,EY EPM - Lista,Estilo 3,Guión,HOJA,Lista vistosa - Énfasis 11,NORMAL,Titulo 8"/>
     <w:basedOn w:val="Normal"/>
-    <w:link w:val="ListParagraphChar"/>
+    <w:link w:val="PrrafodelistaCar"/>
     <w:uiPriority w:val="34"/>
     <w:qFormat/>
     <w:rsid w:val="0093169A"/>
@@ -9678,7 +9740,7 @@
   </w:style>
   <w:style w:type="paragraph" w:customStyle="1" w:styleId="DeclaracionesI">
     <w:name w:val="Declaraciones I"/>
-    <w:basedOn w:val="ListParagraph"/>
+    <w:basedOn w:val="Prrafodelista"/>
     <w:link w:val="DeclaracionesICar"/>
     <w:qFormat/>
     <w:rsid w:val="006C789F"/>
@@ -9690,7 +9752,7 @@
   </w:style>
   <w:style w:type="character" w:customStyle="1" w:styleId="DeclaracionesICar">
     <w:name w:val="Declaraciones I Car"/>
-    <w:basedOn w:val="DefaultParagraphFont"/>
+    <w:basedOn w:val="Fuentedeprrafopredeter"/>
     <w:link w:val="DeclaracionesI"/>
     <w:rsid w:val="006C789F"/>
     <w:rPr>
@@ -9700,10 +9762,10 @@
       <w:lang w:val="es-ES" w:eastAsia="es-ES"/>
     </w:rPr>
   </w:style>
-  <w:style w:type="character" w:customStyle="1" w:styleId="ListParagraphChar">
-    <w:name w:val="List Paragraph Char"/>
-    <w:aliases w:val="Título1 Char,Colorful List - Accent 11 Char,Bolita Char,Párrafo antic Char,BOLADEF Char,Párrafo de lista2 Char,Párrafo de lista3 Char,Párrafo de lista21 Char,BOLA Char,1. Anexo Char,Colorful List Accent 1 Char,EY EPM - Lista Char"/>
-    <w:link w:val="ListParagraph"/>
+  <w:style w:type="character" w:customStyle="1" w:styleId="PrrafodelistaCar">
+    <w:name w:val="Párrafo de lista Car"/>
+    <w:aliases w:val="Título1 Car,Colorful List - Accent 11 Car,Bolita Car,Párrafo antic Car,BOLADEF Car,Párrafo de lista2 Car,Párrafo de lista3 Car,Párrafo de lista21 Car,BOLA Car,1. Anexo Car,Colorful List Accent 1 Car,EY EPM - Lista Car,Estilo 3 Car"/>
+    <w:link w:val="Prrafodelista"/>
     <w:uiPriority w:val="1"/>
     <w:qFormat/>
     <w:rsid w:val="0093169A"/>
@@ -9729,7 +9791,7 @@
   </w:style>
   <w:style w:type="character" w:customStyle="1" w:styleId="cf01">
     <w:name w:val="cf01"/>
-    <w:basedOn w:val="DefaultParagraphFont"/>
+    <w:basedOn w:val="Fuentedeprrafopredeter"/>
     <w:rsid w:val="00B745D7"/>
     <w:rPr>
       <w:rFonts w:ascii="Segoe UI" w:hAnsi="Segoe UI" w:cs="Segoe UI" w:hint="default"/>
@@ -9755,11 +9817,11 @@
       <w:lang w:val="es-ES"/>
     </w:rPr>
   </w:style>
-  <w:style w:type="character" w:customStyle="1" w:styleId="Heading1Char">
-    <w:name w:val="Heading 1 Char"/>
-    <w:aliases w:val="H1 Char,H1-Heading 1 Char,Header 1 Char,Heading 0 Char,Hoofdstukkop Char,Legal Line 1 Char,Lev 1 Char,MT1 Char,Niveau 1 Char,SECTION Char,Section Char,Section Heading Char,Titulo 1 Char,Título 1 Car Char,h1 Char,head 1 Char,l1 Char"/>
-    <w:basedOn w:val="DefaultParagraphFont"/>
-    <w:link w:val="Heading1"/>
+  <w:style w:type="character" w:customStyle="1" w:styleId="Ttulo1Car1">
+    <w:name w:val="Título 1 Car1"/>
+    <w:aliases w:val="H1 Car,H1-Heading 1 Car,Header 1 Car,Heading 0 Car,Hoofdstukkop Car,Legal Line 1 Car,Lev 1 Car,MT1 Car,Niveau 1 Car,SECTION Car,Section Car,Section Heading Car,Titulo 1 Car,Título 1 Car Car,h1 Car,head 1 Car,l1 Car,level 1 Car,level1 Car"/>
+    <w:basedOn w:val="Fuentedeprrafopredeter"/>
+    <w:link w:val="Ttulo1"/>
     <w:uiPriority w:val="9"/>
     <w:rsid w:val="00DB0FBF"/>
     <w:rPr>
@@ -9771,11 +9833,11 @@
       <w:lang w:val="es-CO" w:eastAsia="es-CO"/>
     </w:rPr>
   </w:style>
-  <w:style w:type="character" w:customStyle="1" w:styleId="Heading2Char">
-    <w:name w:val="Heading 2 Char"/>
-    <w:aliases w:val="H2 Char Char,Subsección Char,Título 2 Car Car Char,Título 2 Car Car Car Car Char,Título 2 Car1 Char,Título 2 Car1 Car Car Char,SECCIONES Char,BONUS-T2 Char"/>
-    <w:basedOn w:val="DefaultParagraphFont"/>
-    <w:link w:val="Heading2"/>
+  <w:style w:type="character" w:customStyle="1" w:styleId="Ttulo2Car">
+    <w:name w:val="Título 2 Car"/>
+    <w:aliases w:val="H2 Char Car,Subsección Car,Título 2 Car Car Car,Título 2 Car Car Car Car Car,Título 2 Car1 Car,Título 2 Car1 Car Car Car,SECCIONES Car,BONUS-T2 Car"/>
+    <w:basedOn w:val="Fuentedeprrafopredeter"/>
+    <w:link w:val="Ttulo2"/>
     <w:uiPriority w:val="9"/>
     <w:rsid w:val="000B498A"/>
     <w:rPr>
@@ -9786,11 +9848,11 @@
       <w:lang w:val="es-CO" w:eastAsia="es-CO"/>
     </w:rPr>
   </w:style>
-  <w:style w:type="character" w:customStyle="1" w:styleId="Heading3Char">
-    <w:name w:val="Heading 3 Char"/>
-    <w:aliases w:val="Style 46 Char,BONUS-T3 Final Char,Edgar 3 Char,1.1.1Título 3 Char,Título 3-BCN Char,3 bullet Char,2 Char,H3 Char,1 Char,1Título 3 Char"/>
-    <w:basedOn w:val="DefaultParagraphFont"/>
-    <w:link w:val="Heading3"/>
+  <w:style w:type="character" w:customStyle="1" w:styleId="Ttulo3Car">
+    <w:name w:val="Título 3 Car"/>
+    <w:aliases w:val="Style 46 Car,BONUS-T3 Final Car,Edgar 3 Car,1.1.1Título 3 Car,Título 3-BCN Car,3 bullet Car,2 Car,H3 Car,1 Car,1Título 3 Car"/>
+    <w:basedOn w:val="Fuentedeprrafopredeter"/>
+    <w:link w:val="Ttulo3"/>
     <w:rsid w:val="000B498A"/>
     <w:rPr>
       <w:rFonts w:ascii="Open Sans" w:eastAsiaTheme="majorEastAsia" w:hAnsi="Open Sans" w:cstheme="majorBidi"/>
@@ -9798,10 +9860,10 @@
       <w:lang w:val="es-CO" w:eastAsia="es-CO"/>
     </w:rPr>
   </w:style>
-  <w:style w:type="character" w:customStyle="1" w:styleId="Heading4Char">
-    <w:name w:val="Heading 4 Char"/>
-    <w:basedOn w:val="DefaultParagraphFont"/>
-    <w:link w:val="Heading4"/>
+  <w:style w:type="character" w:customStyle="1" w:styleId="Ttulo4Car">
+    <w:name w:val="Título 4 Car"/>
+    <w:basedOn w:val="Fuentedeprrafopredeter"/>
+    <w:link w:val="Ttulo4"/>
     <w:rsid w:val="000B498A"/>
     <w:rPr>
       <w:rFonts w:ascii="Open Sans" w:eastAsiaTheme="majorEastAsia" w:hAnsi="Open Sans" w:cstheme="majorBidi"/>
@@ -9811,10 +9873,10 @@
       <w:lang w:val="es-CO" w:eastAsia="es-CO"/>
     </w:rPr>
   </w:style>
-  <w:style w:type="character" w:customStyle="1" w:styleId="Heading5Char">
-    <w:name w:val="Heading 5 Char"/>
-    <w:basedOn w:val="DefaultParagraphFont"/>
-    <w:link w:val="Heading5"/>
+  <w:style w:type="character" w:customStyle="1" w:styleId="Ttulo5Car">
+    <w:name w:val="Título 5 Car"/>
+    <w:basedOn w:val="Fuentedeprrafopredeter"/>
+    <w:link w:val="Ttulo5"/>
     <w:rsid w:val="000B498A"/>
     <w:rPr>
       <w:rFonts w:ascii="Open Sans" w:eastAsiaTheme="majorEastAsia" w:hAnsi="Open Sans" w:cstheme="majorBidi"/>
@@ -9823,7 +9885,7 @@
       <w:lang w:val="es-CO" w:eastAsia="es-CO"/>
     </w:rPr>
   </w:style>
-  <w:style w:type="paragraph" w:styleId="Revision">
+  <w:style w:type="paragraph" w:styleId="Revisin">
     <w:name w:val="Revision"/>
     <w:hidden/>
     <w:uiPriority w:val="99"/>
@@ -9858,7 +9920,7 @@
   </w:style>
   <w:style w:type="table" w:customStyle="1" w:styleId="5">
     <w:name w:val="5"/>
-    <w:basedOn w:val="TableNormal"/>
+    <w:basedOn w:val="Tablanormal"/>
     <w:rsid w:val="00DB0FBF"/>
     <w:pPr>
       <w:widowControl w:val="0"/>
@@ -9883,10 +9945,10 @@
       </w:tblCellMar>
     </w:tblPr>
   </w:style>
-  <w:style w:type="paragraph" w:styleId="Header">
+  <w:style w:type="paragraph" w:styleId="Encabezado">
     <w:name w:val="header"/>
     <w:basedOn w:val="Normal"/>
-    <w:link w:val="HeaderChar"/>
+    <w:link w:val="EncabezadoCar"/>
     <w:uiPriority w:val="99"/>
     <w:unhideWhenUsed/>
     <w:rsid w:val="000C7422"/>
@@ -9898,10 +9960,10 @@
       <w:spacing w:after="0"/>
     </w:pPr>
   </w:style>
-  <w:style w:type="character" w:customStyle="1" w:styleId="HeaderChar">
-    <w:name w:val="Header Char"/>
-    <w:basedOn w:val="DefaultParagraphFont"/>
-    <w:link w:val="Header"/>
+  <w:style w:type="character" w:customStyle="1" w:styleId="EncabezadoCar">
+    <w:name w:val="Encabezado Car"/>
+    <w:basedOn w:val="Fuentedeprrafopredeter"/>
+    <w:link w:val="Encabezado"/>
     <w:uiPriority w:val="99"/>
     <w:rsid w:val="000C7422"/>
     <w:rPr>
@@ -9911,10 +9973,10 @@
       <w:lang w:val="es-CO" w:eastAsia="es-CO"/>
     </w:rPr>
   </w:style>
-  <w:style w:type="paragraph" w:styleId="Footer">
+  <w:style w:type="paragraph" w:styleId="Piedepgina">
     <w:name w:val="footer"/>
     <w:basedOn w:val="Normal"/>
-    <w:link w:val="FooterChar"/>
+    <w:link w:val="PiedepginaCar"/>
     <w:uiPriority w:val="99"/>
     <w:unhideWhenUsed/>
     <w:rsid w:val="000C7422"/>
@@ -9926,10 +9988,10 @@
       <w:spacing w:after="0"/>
     </w:pPr>
   </w:style>
-  <w:style w:type="character" w:customStyle="1" w:styleId="FooterChar">
-    <w:name w:val="Footer Char"/>
-    <w:basedOn w:val="DefaultParagraphFont"/>
-    <w:link w:val="Footer"/>
+  <w:style w:type="character" w:customStyle="1" w:styleId="PiedepginaCar">
+    <w:name w:val="Pie de página Car"/>
+    <w:basedOn w:val="Fuentedeprrafopredeter"/>
+    <w:link w:val="Piedepgina"/>
     <w:uiPriority w:val="99"/>
     <w:rsid w:val="000C7422"/>
     <w:rPr>

</xml_diff>